<commit_message>
Update to Stage 1
</commit_message>
<xml_diff>
--- a/Docs/Capstone_Project/02_Stage_Workbooks/Stage_1_Discovery_Workbook.docx
+++ b/Docs/Capstone_Project/02_Stage_Workbooks/Stage_1_Discovery_Workbook.docx
@@ -7651,6 +7651,13 @@
             <w:pPr>
               <w:spacing w:before="50" w:after="50"/>
             </w:pPr>
+            <w:r>
+              <w:rPr>
+                <w:b/>
+                <w:bCs/>
+              </w:rPr>
+              <w:t>Time to first reply</w:t>
+            </w:r>
           </w:p>
         </w:tc>
         <w:tc>
@@ -7666,7 +7673,11 @@
           <w:p>
             <w:pPr>
               <w:spacing w:before="50" w:after="50"/>
-            </w:pPr>
+              <w:jc w:val="center"/>
+            </w:pPr>
+            <w:r>
+              <w:t>1) The executive team, via Marcus's report. 2) It is the SLA figure: "Response time is what is in the agreement so it is what gets reported."</w:t>
+            </w:r>
           </w:p>
         </w:tc>
         <w:tc>
@@ -7683,6 +7694,17 @@
             <w:pPr>
               <w:spacing w:before="50" w:after="50"/>
             </w:pPr>
+            <w:r>
+              <w:t xml:space="preserve">1) 8 to 12 hours (Marcus, and the brief). </w:t>
+            </w:r>
+          </w:p>
+          <w:p>
+            <w:pPr>
+              <w:spacing w:before="50" w:after="50"/>
+            </w:pPr>
+            <w:r>
+              <w:t>2) Not verifiable in the data: no first-reply timestamp exists; nearest proxy is resolution time, median 214 min, only 45% within 2 h.</w:t>
+            </w:r>
           </w:p>
         </w:tc>
         <w:tc>
@@ -7697,6 +7719,42 @@
           </w:tcPr>
           <w:p>
             <w:pPr>
+              <w:numPr>
+                <w:ilvl w:val="0"/>
+                <w:numId w:val="38"/>
+              </w:numPr>
+              <w:spacing w:before="50" w:after="50"/>
+              <w:rPr>
+                <w:lang w:val="en-IN"/>
+              </w:rPr>
+            </w:pPr>
+            <w:r>
+              <w:rPr>
+                <w:lang w:val="en-IN"/>
+              </w:rPr>
+              <w:t xml:space="preserve">Under 2 hours, the SLA. </w:t>
+            </w:r>
+          </w:p>
+          <w:p>
+            <w:pPr>
+              <w:numPr>
+                <w:ilvl w:val="0"/>
+                <w:numId w:val="38"/>
+              </w:numPr>
+              <w:spacing w:before="50" w:after="50"/>
+              <w:rPr>
+                <w:lang w:val="en-IN"/>
+              </w:rPr>
+            </w:pPr>
+            <w:r>
+              <w:rPr>
+                <w:lang w:val="en-IN"/>
+              </w:rPr>
+              <w:t>Under 5 minutes for the automated first response (Evaluation Framework).</w:t>
+            </w:r>
+          </w:p>
+          <w:p>
+            <w:pPr>
               <w:spacing w:before="50" w:after="50"/>
             </w:pPr>
           </w:p>
@@ -7714,6 +7772,15 @@
           <w:p>
             <w:pPr>
               <w:spacing w:before="50" w:after="50"/>
+            </w:pPr>
+            <w:r>
+              <w:t>Medium. Stated by the client and the pack, but no field in the data to confirm it.</w:t>
+            </w:r>
+          </w:p>
+          <w:p/>
+          <w:p>
+            <w:pPr>
+              <w:ind w:firstLine="720"/>
             </w:pPr>
           </w:p>
         </w:tc>
@@ -7736,7 +7803,15 @@
           <w:p>
             <w:pPr>
               <w:spacing w:before="50" w:after="50"/>
-            </w:pPr>
+              <w:jc w:val="center"/>
+            </w:pPr>
+            <w:r>
+              <w:rPr>
+                <w:b/>
+                <w:bCs/>
+              </w:rPr>
+              <w:t>First contact resolution</w:t>
+            </w:r>
           </w:p>
         </w:tc>
         <w:tc>
@@ -7753,7 +7828,11 @@
           <w:p>
             <w:pPr>
               <w:spacing w:before="50" w:after="50"/>
-            </w:pPr>
+              <w:jc w:val="center"/>
+            </w:pPr>
+            <w:r>
+              <w:t>1) Marcus: "First contact resolution, if I am being honest, more than response time." 2) Not what he reports upward.</w:t>
+            </w:r>
           </w:p>
         </w:tc>
         <w:tc>
@@ -7771,6 +7850,17 @@
             <w:pPr>
               <w:spacing w:before="50" w:after="50"/>
             </w:pPr>
+            <w:r>
+              <w:t xml:space="preserve">1) 42% (Marcus, brief). </w:t>
+            </w:r>
+          </w:p>
+          <w:p>
+            <w:pPr>
+              <w:spacing w:before="50" w:after="50"/>
+            </w:pPr>
+            <w:r>
+              <w:t>2) 43.8% in the development data.</w:t>
+            </w:r>
           </w:p>
         </w:tc>
         <w:tc>
@@ -7788,6 +7878,17 @@
             <w:pPr>
               <w:spacing w:before="50" w:after="50"/>
             </w:pPr>
+            <w:r>
+              <w:t xml:space="preserve">1) 65%, the benchmark Marcus quotes. </w:t>
+            </w:r>
+          </w:p>
+          <w:p>
+            <w:pPr>
+              <w:spacing w:before="50" w:after="50"/>
+            </w:pPr>
+            <w:r>
+              <w:t>2) 60% or better, the brief and Evaluation Framework target.</w:t>
+            </w:r>
           </w:p>
         </w:tc>
         <w:tc>
@@ -7805,6 +7906,9 @@
             <w:pPr>
               <w:spacing w:before="50" w:after="50"/>
             </w:pPr>
+            <w:r>
+              <w:t> High. Transcript and data agree within two points.</w:t>
+            </w:r>
           </w:p>
         </w:tc>
       </w:tr>
@@ -7826,6 +7930,13 @@
             <w:pPr>
               <w:spacing w:before="50" w:after="50"/>
             </w:pPr>
+            <w:r>
+              <w:rPr>
+                <w:b/>
+                <w:bCs/>
+              </w:rPr>
+              <w:t>Escalation rate</w:t>
+            </w:r>
           </w:p>
         </w:tc>
         <w:tc>
@@ -7842,6 +7953,17 @@
             <w:pPr>
               <w:spacing w:before="50" w:after="50"/>
             </w:pPr>
+            <w:r>
+              <w:t xml:space="preserve">1) Marcus sees the rate. </w:t>
+            </w:r>
+          </w:p>
+          <w:p>
+            <w:pPr>
+              <w:spacing w:before="50" w:after="50"/>
+            </w:pPr>
+            <w:r>
+              <w:t>2) Daniel: "Marcus sees the escalation rate, not what is inside the escalations."</w:t>
+            </w:r>
           </w:p>
         </w:tc>
         <w:tc>
@@ -7855,9 +7977,13 @@
             </w:tcBorders>
           </w:tcPr>
           <w:p>
-            <w:pPr>
-              <w:spacing w:before="50" w:after="50"/>
-            </w:pPr>
+            <w:r>
+              <w:t xml:space="preserve">1) 58% (brief). 2) 56.2% in the data, and 49.1% of those escalations were answerable from the </w:t>
+            </w:r>
+            <w:r>
+              <w:lastRenderedPageBreak/>
+              <w:t>docs.</w:t>
+            </w:r>
           </w:p>
         </w:tc>
         <w:tc>
@@ -7873,7 +7999,12 @@
           <w:p>
             <w:pPr>
               <w:spacing w:before="50" w:after="50"/>
-            </w:pPr>
+              <w:jc w:val="center"/>
+            </w:pPr>
+            <w:r>
+              <w:lastRenderedPageBreak/>
+              <w:t>30% or lower (brief). Reported alongside FCR, since they mirror each other.</w:t>
+            </w:r>
           </w:p>
         </w:tc>
         <w:tc>
@@ -7890,6 +8021,9 @@
             <w:pPr>
               <w:spacing w:before="50" w:after="50"/>
             </w:pPr>
+            <w:r>
+              <w:t>High. Two sources agree.</w:t>
+            </w:r>
           </w:p>
         </w:tc>
       </w:tr>
@@ -7912,6 +8046,13 @@
             <w:pPr>
               <w:spacing w:before="50" w:after="50"/>
             </w:pPr>
+            <w:r>
+              <w:rPr>
+                <w:b/>
+                <w:bCs/>
+              </w:rPr>
+              <w:t>Customer satisfaction</w:t>
+            </w:r>
           </w:p>
         </w:tc>
         <w:tc>
@@ -7929,6 +8070,17 @@
             <w:pPr>
               <w:spacing w:before="50" w:after="50"/>
             </w:pPr>
+            <w:r>
+              <w:t xml:space="preserve"> 1) Marcus. </w:t>
+            </w:r>
+          </w:p>
+          <w:p>
+            <w:pPr>
+              <w:spacing w:before="50" w:after="50"/>
+            </w:pPr>
+            <w:r>
+              <w:t>2) Sales, indirectly: "renewal conversations have started going badly" (brief).</w:t>
+            </w:r>
           </w:p>
         </w:tc>
         <w:tc>
@@ -7945,7 +8097,20 @@
           <w:p>
             <w:pPr>
               <w:spacing w:before="50" w:after="50"/>
-            </w:pPr>
+              <w:jc w:val="center"/>
+            </w:pPr>
+            <w:r>
+              <w:t xml:space="preserve">1) 3.2 out of 5 (brief). </w:t>
+            </w:r>
+          </w:p>
+          <w:p>
+            <w:pPr>
+              <w:spacing w:before="50" w:after="50"/>
+              <w:jc w:val="center"/>
+            </w:pPr>
+            <w:r>
+              <w:t>2) 2.97 in the data; 39% of tickets rate 1 or 2; resolved tickets 3.41, escalated 2.63.</w:t>
+            </w:r>
           </w:p>
         </w:tc>
         <w:tc>
@@ -7963,6 +8128,9 @@
             <w:pPr>
               <w:spacing w:before="50" w:after="50"/>
             </w:pPr>
+            <w:r>
+              <w:t>4.2 (brief) or 4.0 (Evaluation Framework).</w:t>
+            </w:r>
           </w:p>
         </w:tc>
         <w:tc>
@@ -7980,6 +8148,9 @@
             <w:pPr>
               <w:spacing w:before="50" w:after="50"/>
             </w:pPr>
+            <w:r>
+              <w:t>Medium. The two sources differ by 0.23, and the project can only measure a rubric proxy, not live customers.</w:t>
+            </w:r>
           </w:p>
         </w:tc>
       </w:tr>
@@ -8001,6 +8172,13 @@
             <w:pPr>
               <w:spacing w:before="50" w:after="50"/>
             </w:pPr>
+            <w:r>
+              <w:rPr>
+                <w:b/>
+                <w:bCs/>
+              </w:rPr>
+              <w:t>Cost of an escalated ticket</w:t>
+            </w:r>
           </w:p>
         </w:tc>
         <w:tc>
@@ -8016,7 +8194,11 @@
           <w:p>
             <w:pPr>
               <w:spacing w:before="50" w:after="50"/>
-            </w:pPr>
+              <w:jc w:val="center"/>
+            </w:pPr>
+            <w:r>
+              <w:t>Marcus, as budget owner: "every ticket that bounces to tier two costs us roughly four times what a resolved one costs."</w:t>
+            </w:r>
           </w:p>
         </w:tc>
         <w:tc>
@@ -8033,6 +8215,25 @@
             <w:pPr>
               <w:spacing w:before="50" w:after="50"/>
             </w:pPr>
+            <w:r>
+              <w:t xml:space="preserve">1) About 4× a resolved ticket. </w:t>
+            </w:r>
+          </w:p>
+          <w:p>
+            <w:pPr>
+              <w:spacing w:before="50" w:after="50"/>
+            </w:pPr>
+            <w:r>
+              <w:t xml:space="preserve">2) Not in the data. </w:t>
+            </w:r>
+          </w:p>
+          <w:p>
+            <w:pPr>
+              <w:spacing w:before="50" w:after="50"/>
+            </w:pPr>
+            <w:r>
+              <w:t>3) 138 answerable tickets were escalated, so that cost was paid 138 times unnecessarily in the sample.</w:t>
+            </w:r>
           </w:p>
         </w:tc>
         <w:tc>
@@ -8049,6 +8250,9 @@
             <w:pPr>
               <w:spacing w:before="50" w:after="50"/>
             </w:pPr>
+            <w:r>
+              <w:t>Fewer escalations of answerable tickets; headcount not increased ("three more headcount that I am not going to get").</w:t>
+            </w:r>
           </w:p>
         </w:tc>
         <w:tc>
@@ -8065,6 +8269,9 @@
             <w:pPr>
               <w:spacing w:before="50" w:after="50"/>
             </w:pPr>
+            <w:r>
+              <w:t>Low. A single verbal estimate, no cost data.</w:t>
+            </w:r>
           </w:p>
         </w:tc>
       </w:tr>
@@ -8087,6 +8294,13 @@
             <w:pPr>
               <w:spacing w:before="50" w:after="50"/>
             </w:pPr>
+            <w:r>
+              <w:rPr>
+                <w:b/>
+                <w:bCs/>
+              </w:rPr>
+              <w:t>Repeat contacts</w:t>
+            </w:r>
           </w:p>
         </w:tc>
         <w:tc>
@@ -8104,6 +8318,9 @@
             <w:pPr>
               <w:spacing w:before="50" w:after="50"/>
             </w:pPr>
+            <w:r>
+              <w:t>Nobody today. The brief lists it as "not measured".</w:t>
+            </w:r>
           </w:p>
         </w:tc>
         <w:tc>
@@ -8121,6 +8338,9 @@
             <w:pPr>
               <w:spacing w:before="50" w:after="50"/>
             </w:pPr>
+            <w:r>
+              <w:t>21.6% in the data; 0% of resolved tickets, 38.4% of escalated.</w:t>
+            </w:r>
           </w:p>
         </w:tc>
         <w:tc>
@@ -8138,6 +8358,9 @@
             <w:pPr>
               <w:spacing w:before="50" w:after="50"/>
             </w:pPr>
+            <w:r>
+              <w:t>Halved (brief and Evaluation Framework).</w:t>
+            </w:r>
           </w:p>
         </w:tc>
         <w:tc>
@@ -8155,6 +8378,9 @@
             <w:pPr>
               <w:spacing w:before="50" w:after="50"/>
             </w:pPr>
+            <w:r>
+              <w:t>High for the baseline, since it is counted directly; the target is the pack's, not the client's.</w:t>
+            </w:r>
           </w:p>
         </w:tc>
       </w:tr>
@@ -8176,6 +8402,13 @@
             <w:pPr>
               <w:spacing w:before="50" w:after="50"/>
             </w:pPr>
+            <w:r>
+              <w:rPr>
+                <w:b/>
+                <w:bCs/>
+              </w:rPr>
+              <w:t>No wrong answer sent to a customer</w:t>
+            </w:r>
           </w:p>
         </w:tc>
         <w:tc>
@@ -8192,6 +8425,21 @@
             <w:pPr>
               <w:spacing w:before="50" w:after="50"/>
             </w:pPr>
+            <w:r>
+              <w:t xml:space="preserve">1) Marcus: "If it sends something wrong to a customer… I would rather it said nothing than said something wrong." </w:t>
+            </w:r>
+          </w:p>
+          <w:p>
+            <w:pPr>
+              <w:spacing w:before="50" w:after="50"/>
+            </w:pPr>
+            <w:r>
+              <w:t xml:space="preserve">2) Sofia fears picking up the </w:t>
+            </w:r>
+            <w:r>
+              <w:lastRenderedPageBreak/>
+              <w:t>angry follow-up. 3) Ravi: "I will act on it and break something."</w:t>
+            </w:r>
           </w:p>
         </w:tc>
         <w:tc>
@@ -8208,6 +8456,10 @@
             <w:pPr>
               <w:spacing w:before="50" w:after="50"/>
             </w:pPr>
+            <w:r>
+              <w:lastRenderedPageBreak/>
+              <w:t>Not measured today.</w:t>
+            </w:r>
           </w:p>
         </w:tc>
         <w:tc>
@@ -8224,6 +8476,9 @@
             <w:pPr>
               <w:spacing w:before="50" w:after="50"/>
             </w:pPr>
+            <w:r>
+              <w:t>Zero confidently wrong automated answers; escalation instead of guessing.</w:t>
+            </w:r>
           </w:p>
         </w:tc>
         <w:tc>
@@ -8240,6 +8495,120 @@
             <w:pPr>
               <w:spacing w:before="50" w:after="50"/>
             </w:pPr>
+            <w:r>
+              <w:t>High that it is the client's first failure condition. Three of five stakeholders name it unprompted.</w:t>
+            </w:r>
+          </w:p>
+        </w:tc>
+      </w:tr>
+      <w:tr>
+        <w:trPr>
+          <w:jc w:val="center"/>
+        </w:trPr>
+        <w:tc>
+          <w:tcPr>
+            <w:tcW w:w="2016" w:type="dxa"/>
+            <w:tcBorders>
+              <w:top w:val="single" w:sz="6" w:space="0" w:color="D9D9E0"/>
+              <w:left w:val="single" w:sz="6" w:space="0" w:color="D9D9E0"/>
+              <w:bottom w:val="single" w:sz="6" w:space="0" w:color="D9D9E0"/>
+              <w:right w:val="single" w:sz="6" w:space="0" w:color="D9D9E0"/>
+            </w:tcBorders>
+          </w:tcPr>
+          <w:p>
+            <w:pPr>
+              <w:spacing w:before="50" w:after="50"/>
+              <w:rPr>
+                <w:b/>
+                <w:bCs/>
+              </w:rPr>
+            </w:pPr>
+            <w:r>
+              <w:rPr>
+                <w:b/>
+                <w:bCs/>
+              </w:rPr>
+              <w:t>Enterprise service level</w:t>
+            </w:r>
+          </w:p>
+        </w:tc>
+        <w:tc>
+          <w:tcPr>
+            <w:tcW w:w="1728" w:type="dxa"/>
+            <w:tcBorders>
+              <w:top w:val="single" w:sz="6" w:space="0" w:color="D9D9E0"/>
+              <w:left w:val="single" w:sz="6" w:space="0" w:color="D9D9E0"/>
+              <w:bottom w:val="single" w:sz="6" w:space="0" w:color="D9D9E0"/>
+              <w:right w:val="single" w:sz="6" w:space="0" w:color="D9D9E0"/>
+            </w:tcBorders>
+          </w:tcPr>
+          <w:p>
+            <w:pPr>
+              <w:spacing w:before="50" w:after="50"/>
+            </w:pPr>
+            <w:r>
+              <w:t>Marcus and Ravi</w:t>
+            </w:r>
+          </w:p>
+        </w:tc>
+        <w:tc>
+          <w:tcPr>
+            <w:tcW w:w="1440" w:type="dxa"/>
+            <w:tcBorders>
+              <w:top w:val="single" w:sz="6" w:space="0" w:color="D9D9E0"/>
+              <w:left w:val="single" w:sz="6" w:space="0" w:color="D9D9E0"/>
+              <w:bottom w:val="single" w:sz="6" w:space="0" w:color="D9D9E0"/>
+              <w:right w:val="single" w:sz="6" w:space="0" w:color="D9D9E0"/>
+            </w:tcBorders>
+          </w:tcPr>
+          <w:p>
+            <w:pPr>
+              <w:spacing w:before="50" w:after="50"/>
+            </w:pPr>
+            <w:r>
+              <w:t>enterprise is the slowest tier, median 369 min, FCR 37.3%;</w:t>
+            </w:r>
+          </w:p>
+        </w:tc>
+        <w:tc>
+          <w:tcPr>
+            <w:tcW w:w="2448" w:type="dxa"/>
+            <w:tcBorders>
+              <w:top w:val="single" w:sz="6" w:space="0" w:color="D9D9E0"/>
+              <w:left w:val="single" w:sz="6" w:space="0" w:color="D9D9E0"/>
+              <w:bottom w:val="single" w:sz="6" w:space="0" w:color="D9D9E0"/>
+              <w:right w:val="single" w:sz="6" w:space="0" w:color="D9D9E0"/>
+            </w:tcBorders>
+          </w:tcPr>
+          <w:p>
+            <w:pPr>
+              <w:spacing w:before="50" w:after="50"/>
+            </w:pPr>
+            <w:r>
+              <w:t>no widening of the gap, under 5 points variation across groups</w:t>
+            </w:r>
+            <w:r>
+              <w:t>.</w:t>
+            </w:r>
+          </w:p>
+        </w:tc>
+        <w:tc>
+          <w:tcPr>
+            <w:tcW w:w="2016" w:type="dxa"/>
+            <w:tcBorders>
+              <w:top w:val="single" w:sz="6" w:space="0" w:color="D9D9E0"/>
+              <w:left w:val="single" w:sz="6" w:space="0" w:color="D9D9E0"/>
+              <w:bottom w:val="single" w:sz="6" w:space="0" w:color="D9D9E0"/>
+              <w:right w:val="single" w:sz="6" w:space="0" w:color="D9D9E0"/>
+            </w:tcBorders>
+          </w:tcPr>
+          <w:p>
+            <w:pPr>
+              <w:spacing w:before="50" w:after="50"/>
+            </w:pPr>
+            <w:r>
+              <w:t>medium</w:t>
+            </w:r>
           </w:p>
         </w:tc>
       </w:tr>
@@ -8373,6 +8742,59 @@
             <w:pPr>
               <w:spacing w:before="50" w:after="50"/>
             </w:pPr>
+            <w:r>
+              <w:t>1) first contact resolution rises from 42 to 44% toward 60 to 65%</w:t>
+            </w:r>
+            <w:r>
+              <w:t>.</w:t>
+            </w:r>
+          </w:p>
+          <w:p>
+            <w:pPr>
+              <w:spacing w:before="50" w:after="50"/>
+            </w:pPr>
+            <w:r>
+              <w:t>2) escalation falls from 56 to 58% toward 30%</w:t>
+            </w:r>
+            <w:r>
+              <w:t>.</w:t>
+            </w:r>
+          </w:p>
+          <w:p>
+            <w:pPr>
+              <w:spacing w:before="50" w:after="50"/>
+            </w:pPr>
+            <w:r>
+              <w:t>3) the answerable tickets that today reach tier two, 138 of 500 in the sample, are answered on first contact</w:t>
+            </w:r>
+            <w:r>
+              <w:t>.</w:t>
+            </w:r>
+          </w:p>
+          <w:p>
+            <w:pPr>
+              <w:spacing w:before="50" w:after="50"/>
+            </w:pPr>
+            <w:r>
+              <w:t>4) repeat contacts fall from 21.6% toward 11%</w:t>
+            </w:r>
+            <w:r>
+              <w:t>.</w:t>
+            </w:r>
+            <w:r>
+              <w:t xml:space="preserve"> </w:t>
+            </w:r>
+          </w:p>
+          <w:p>
+            <w:pPr>
+              <w:spacing w:before="50" w:after="50"/>
+            </w:pPr>
+            <w:r>
+              <w:t>5) no confidently wrong answer has been sent</w:t>
+            </w:r>
+            <w:r>
+              <w:t>.</w:t>
+            </w:r>
           </w:p>
         </w:tc>
       </w:tr>
@@ -8418,6 +8840,48 @@
             <w:pPr>
               <w:spacing w:before="50" w:after="50"/>
             </w:pPr>
+            <w:r>
+              <w:t> 1) a wrong answer sent to a customer</w:t>
+            </w:r>
+            <w:r>
+              <w:t>.</w:t>
+            </w:r>
+            <w:r>
+              <w:t xml:space="preserve"> </w:t>
+            </w:r>
+          </w:p>
+          <w:p>
+            <w:pPr>
+              <w:spacing w:before="50" w:after="50"/>
+            </w:pPr>
+            <w:r>
+              <w:t>2) escalations still arriving without a draft and sources, so tier two is no faster</w:t>
+            </w:r>
+            <w:r>
+              <w:t>.</w:t>
+            </w:r>
+          </w:p>
+          <w:p>
+            <w:pPr>
+              <w:spacing w:before="50" w:after="50"/>
+            </w:pPr>
+            <w:r>
+              <w:t xml:space="preserve">3) agent workload rising as it did with </w:t>
+            </w:r>
+            <w:r>
+              <w:t>canned.</w:t>
+            </w:r>
+          </w:p>
+          <w:p>
+            <w:pPr>
+              <w:spacing w:before="50" w:after="50"/>
+            </w:pPr>
+            <w:r>
+              <w:t>4) the enterprise tier falling further behind</w:t>
+            </w:r>
+            <w:r>
+              <w:t>.</w:t>
+            </w:r>
           </w:p>
         </w:tc>
       </w:tr>
@@ -8461,6 +8925,14 @@
             <w:pPr>
               <w:spacing w:before="50" w:after="50"/>
             </w:pPr>
+            <w:r>
+              <w:t xml:space="preserve">time to first reply against the 2-hour SLA, because it is the number the executive team sees every quarter, even though Marcus himself says first contact resolution matters </w:t>
+            </w:r>
+            <w:proofErr w:type="gramStart"/>
+            <w:r>
+              <w:t>more .</w:t>
+            </w:r>
+            <w:proofErr w:type="gramEnd"/>
           </w:p>
         </w:tc>
       </w:tr>
@@ -8689,6 +9161,33 @@
             <w:pPr>
               <w:spacing w:before="50" w:after="50"/>
             </w:pPr>
+            <w:r>
+              <w:t xml:space="preserve">1) 500 tickets, 4 channels. </w:t>
+            </w:r>
+          </w:p>
+          <w:p>
+            <w:pPr>
+              <w:spacing w:before="50" w:after="50"/>
+            </w:pPr>
+            <w:r>
+              <w:t xml:space="preserve">2) Subject, body, timestamp, customer id and name, tier, region, fluency flag. </w:t>
+            </w:r>
+          </w:p>
+          <w:p>
+            <w:pPr>
+              <w:spacing w:before="50" w:after="50"/>
+            </w:pPr>
+            <w:r>
+              <w:t xml:space="preserve">3) Labels: intent, urgency, expected route, answerable, expected doc ids, must-not-auto. </w:t>
+            </w:r>
+          </w:p>
+          <w:p>
+            <w:pPr>
+              <w:spacing w:before="50" w:after="50"/>
+            </w:pPr>
+            <w:r>
+              <w:t>4) History: FCR, resolution minutes, CSAT, escalated, repeat.</w:t>
+            </w:r>
           </w:p>
         </w:tc>
         <w:tc>
@@ -8705,6 +9204,41 @@
             <w:pPr>
               <w:spacing w:before="50" w:after="50"/>
             </w:pPr>
+            <w:r>
+              <w:t xml:space="preserve">1) Labels consistent; every expected doc id resolves to a real article. </w:t>
+            </w:r>
+          </w:p>
+          <w:p>
+            <w:pPr>
+              <w:spacing w:before="50" w:after="50"/>
+            </w:pPr>
+            <w:r>
+              <w:t xml:space="preserve">2) All 155 chat tickets have an empty subject. </w:t>
+            </w:r>
+          </w:p>
+          <w:p>
+            <w:pPr>
+              <w:spacing w:before="50" w:after="50"/>
+            </w:pPr>
+            <w:r>
+              <w:t xml:space="preserve">3) No first-reply timestamp, so the SLA figure cannot be checked. </w:t>
+            </w:r>
+          </w:p>
+          <w:p>
+            <w:pPr>
+              <w:spacing w:before="50" w:after="50"/>
+            </w:pPr>
+            <w:r>
+              <w:t xml:space="preserve">4) Sample is 13 weeks at about 39 a week, not the full queue. </w:t>
+            </w:r>
+          </w:p>
+          <w:p>
+            <w:pPr>
+              <w:spacing w:before="50" w:after="50"/>
+            </w:pPr>
+            <w:r>
+              <w:t>5) History is a failing baseline, not a target (Dataset Guide).</w:t>
+            </w:r>
           </w:p>
         </w:tc>
         <w:tc>
@@ -8721,6 +9255,25 @@
             <w:pPr>
               <w:spacing w:before="50" w:after="50"/>
             </w:pPr>
+            <w:r>
+              <w:t xml:space="preserve"> 1) Development set: use freely. </w:t>
+            </w:r>
+          </w:p>
+          <w:p>
+            <w:pPr>
+              <w:spacing w:before="50" w:after="50"/>
+            </w:pPr>
+            <w:r>
+              <w:t xml:space="preserve">2) Validation set (80): held back until the system is built. </w:t>
+            </w:r>
+          </w:p>
+          <w:p>
+            <w:pPr>
+              <w:spacing w:before="50" w:after="50"/>
+            </w:pPr>
+            <w:r>
+              <w:t>3) Hidden set (120): never seen; harness must take an input path.</w:t>
+            </w:r>
           </w:p>
         </w:tc>
         <w:tc>
@@ -8737,6 +9290,25 @@
             <w:pPr>
               <w:spacing w:before="50" w:after="50"/>
             </w:pPr>
+            <w:r>
+              <w:t xml:space="preserve">Yes. </w:t>
+            </w:r>
+            <w:proofErr w:type="spellStart"/>
+            <w:r>
+              <w:t>customer_name</w:t>
+            </w:r>
+            <w:proofErr w:type="spellEnd"/>
+            <w:r>
+              <w:t xml:space="preserve"> and </w:t>
+            </w:r>
+            <w:proofErr w:type="spellStart"/>
+            <w:r>
+              <w:t>customer_id</w:t>
+            </w:r>
+            <w:proofErr w:type="spellEnd"/>
+            <w:r>
+              <w:t xml:space="preserve"> on every ticket. Free text scan found no emails, keys, IPs, card or phone numbers; 39 tickets match a loose account-id pattern, to check by hand.</w:t>
+            </w:r>
           </w:p>
         </w:tc>
       </w:tr>
@@ -8782,6 +9354,57 @@
             <w:pPr>
               <w:spacing w:before="50" w:after="50"/>
             </w:pPr>
+            <w:r>
+              <w:t>1) 29 knowledge-</w:t>
+            </w:r>
+            <w:proofErr w:type="spellStart"/>
+            <w:r>
+              <w:t>base</w:t>
+            </w:r>
+            <w:proofErr w:type="spellEnd"/>
+            <w:r>
+              <w:t xml:space="preserve"> articles in 10 categories. </w:t>
+            </w:r>
+          </w:p>
+          <w:p>
+            <w:pPr>
+              <w:spacing w:before="50" w:after="50"/>
+            </w:pPr>
+            <w:r>
+              <w:t xml:space="preserve">2) Markdown with fixed headings: Symptoms, Common causes, Resolution, Notes. </w:t>
+            </w:r>
+          </w:p>
+          <w:p>
+            <w:pPr>
+              <w:spacing w:before="50" w:after="50"/>
+            </w:pPr>
+            <w:r>
+              <w:t xml:space="preserve">3) </w:t>
+            </w:r>
+            <w:proofErr w:type="spellStart"/>
+            <w:r>
+              <w:t>applies_to</w:t>
+            </w:r>
+            <w:proofErr w:type="spellEnd"/>
+            <w:r>
+              <w:t xml:space="preserve">, </w:t>
+            </w:r>
+            <w:proofErr w:type="spellStart"/>
+            <w:r>
+              <w:t>related_docs</w:t>
+            </w:r>
+            <w:proofErr w:type="spellEnd"/>
+            <w:r>
+              <w:t xml:space="preserve">, </w:t>
+            </w:r>
+            <w:proofErr w:type="spellStart"/>
+            <w:r>
+              <w:t>last_reviewed_days_ago</w:t>
+            </w:r>
+            <w:proofErr w:type="spellEnd"/>
+            <w:r>
+              <w:t>.</w:t>
+            </w:r>
           </w:p>
         </w:tc>
         <w:tc>
@@ -8799,6 +9422,50 @@
             <w:pPr>
               <w:spacing w:before="50" w:after="50"/>
             </w:pPr>
+            <w:r>
+              <w:t xml:space="preserve">1) Accurate "within the review cycle" (Ines). </w:t>
+            </w:r>
+          </w:p>
+          <w:p>
+            <w:pPr>
+              <w:spacing w:before="50" w:after="50"/>
+            </w:pPr>
+            <w:r>
+              <w:t xml:space="preserve">2) Covers 71.4% of tickets; every article is the expected source for at least one ticket. </w:t>
+            </w:r>
+          </w:p>
+          <w:p>
+            <w:pPr>
+              <w:spacing w:before="50" w:after="50"/>
+            </w:pPr>
+            <w:r>
+              <w:t xml:space="preserve">3) No article for feature requests, unclear requests, roadmap, or novel incidents. </w:t>
+            </w:r>
+          </w:p>
+          <w:p>
+            <w:pPr>
+              <w:spacing w:before="50" w:after="50"/>
+            </w:pPr>
+            <w:r>
+              <w:t xml:space="preserve">4) </w:t>
+            </w:r>
+            <w:proofErr w:type="spellStart"/>
+            <w:r>
+              <w:lastRenderedPageBreak/>
+              <w:t>last_reviewed_days_ago</w:t>
+            </w:r>
+            <w:proofErr w:type="spellEnd"/>
+            <w:r>
+              <w:t xml:space="preserve"> is 0 on all 29, so there is no usable staleness signal. </w:t>
+            </w:r>
+          </w:p>
+          <w:p>
+            <w:pPr>
+              <w:spacing w:before="50" w:after="50"/>
+            </w:pPr>
+            <w:r>
+              <w:t>5) Dataset Guide says "eight categories" but lists and the data hold ten.</w:t>
+            </w:r>
           </w:p>
         </w:tc>
         <w:tc>
@@ -8816,6 +9483,10 @@
             <w:pPr>
               <w:spacing w:before="50" w:after="50"/>
             </w:pPr>
+            <w:r>
+              <w:lastRenderedPageBreak/>
+              <w:t>Free. It is the retrieval corpus.</w:t>
+            </w:r>
           </w:p>
         </w:tc>
         <w:tc>
@@ -8833,6 +9504,9 @@
             <w:pPr>
               <w:spacing w:before="50" w:after="50"/>
             </w:pPr>
+            <w:r>
+              <w:t>No</w:t>
+            </w:r>
           </w:p>
         </w:tc>
       </w:tr>
@@ -8884,6 +9558,46 @@
             <w:pPr>
               <w:spacing w:before="50" w:after="50"/>
             </w:pPr>
+            <w:r>
+              <w:t>1) The history block per ticket: outcome only, no answer text. 2)</w:t>
+            </w:r>
+            <w:proofErr w:type="spellStart"/>
+            <w:r>
+              <w:t>ground_truth_</w:t>
+            </w:r>
+            <w:proofErr w:type="gramStart"/>
+            <w:r>
+              <w:t>responses.json</w:t>
+            </w:r>
+            <w:proofErr w:type="spellEnd"/>
+            <w:proofErr w:type="gramEnd"/>
+            <w:r>
+              <w:t xml:space="preserve">: 200 answers by senior agents with </w:t>
+            </w:r>
+            <w:proofErr w:type="spellStart"/>
+            <w:r>
+              <w:t>must_mention</w:t>
+            </w:r>
+            <w:proofErr w:type="spellEnd"/>
+            <w:r>
+              <w:t xml:space="preserve"> and </w:t>
+            </w:r>
+            <w:proofErr w:type="spellStart"/>
+            <w:r>
+              <w:t>must_not_claim</w:t>
+            </w:r>
+            <w:proofErr w:type="spellEnd"/>
+            <w:r>
+              <w:t xml:space="preserve"> lists. 3) Agents' private snippet files (Sofia, Daniel, </w:t>
+            </w:r>
+            <w:proofErr w:type="gramStart"/>
+            <w:r>
+              <w:t>Ines</w:t>
+            </w:r>
+            <w:proofErr w:type="gramEnd"/>
+            <w:r>
+              <w:t xml:space="preserve"> all mention them).</w:t>
+            </w:r>
           </w:p>
         </w:tc>
         <w:tc>
@@ -8897,9 +9611,38 @@
             </w:tcBorders>
           </w:tcPr>
           <w:p>
-            <w:pPr>
-              <w:spacing w:before="50" w:after="50"/>
-            </w:pPr>
+            <w:r>
+              <w:t xml:space="preserve">1) History gives no answer text to learn from. </w:t>
+            </w:r>
+          </w:p>
+          <w:p>
+            <w:r>
+              <w:t xml:space="preserve">2) Reference answers cover 200 of the 500 tickets and 20 of 22 intents; </w:t>
+            </w:r>
+            <w:proofErr w:type="spellStart"/>
+            <w:r>
+              <w:t>must_not_claim</w:t>
+            </w:r>
+            <w:proofErr w:type="spellEnd"/>
+            <w:r>
+              <w:t xml:space="preserve"> is the same three items on all 200 (refund issued, fixed on our side, delivery date); </w:t>
+            </w:r>
+            <w:proofErr w:type="spellStart"/>
+            <w:r>
+              <w:t>must_mention</w:t>
+            </w:r>
+            <w:proofErr w:type="spellEnd"/>
+            <w:r>
+              <w:t xml:space="preserve"> is empty on 141. </w:t>
+            </w:r>
+          </w:p>
+          <w:p>
+            <w:pPr>
+              <w:jc w:val="center"/>
+            </w:pPr>
+            <w:r>
+              <w:t>3) Private files are unreviewed; Daniel: answers "correct two years ago and have not been right since"; Ines asked twice to consolidate them.</w:t>
+            </w:r>
           </w:p>
         </w:tc>
         <w:tc>
@@ -8917,6 +9660,16 @@
               <w:spacing w:before="50" w:after="50"/>
             </w:pPr>
           </w:p>
+          <w:p>
+            <w:r>
+              <w:t xml:space="preserve">1) History and reference answers: free. </w:t>
+            </w:r>
+          </w:p>
+          <w:p>
+            <w:r>
+              <w:t>2) Private files: not in the pack, and must not be used as a source.</w:t>
+            </w:r>
+          </w:p>
         </w:tc>
         <w:tc>
           <w:tcPr>
@@ -8932,6 +9685,9 @@
             <w:pPr>
               <w:spacing w:before="50" w:after="50"/>
             </w:pPr>
+            <w:r>
+              <w:t>Reference answers: none observed. Private files: unknown.</w:t>
+            </w:r>
           </w:p>
         </w:tc>
       </w:tr>
@@ -8977,6 +9733,25 @@
             <w:pPr>
               <w:spacing w:before="50" w:after="50"/>
             </w:pPr>
+            <w:r>
+              <w:t xml:space="preserve">Only what the ticket carries: </w:t>
+            </w:r>
+            <w:proofErr w:type="spellStart"/>
+            <w:r>
+              <w:t>customer_id</w:t>
+            </w:r>
+            <w:proofErr w:type="spellEnd"/>
+            <w:r>
+              <w:t xml:space="preserve">, </w:t>
+            </w:r>
+            <w:proofErr w:type="spellStart"/>
+            <w:r>
+              <w:t>customer_name</w:t>
+            </w:r>
+            <w:proofErr w:type="spellEnd"/>
+            <w:r>
+              <w:t>, tier, region, fluency flag. No separate customer table.</w:t>
+            </w:r>
           </w:p>
         </w:tc>
         <w:tc>
@@ -8994,6 +9769,29 @@
             <w:pPr>
               <w:spacing w:before="50" w:after="50"/>
             </w:pPr>
+            <w:r>
+              <w:t xml:space="preserve">1) No contract terms or per-tier SLA, although Marcus says enterprise "have a different agreement". </w:t>
+            </w:r>
+          </w:p>
+          <w:p>
+            <w:pPr>
+              <w:spacing w:before="50" w:after="50"/>
+            </w:pPr>
+            <w:r>
+              <w:t xml:space="preserve">2) No renewal data. 3) 220 customers, </w:t>
+            </w:r>
+            <w:r>
+              <w:lastRenderedPageBreak/>
+              <w:t xml:space="preserve">150 with more than one ticket, so repeat </w:t>
+            </w:r>
+            <w:proofErr w:type="spellStart"/>
+            <w:r>
+              <w:t>behaviour</w:t>
+            </w:r>
+            <w:proofErr w:type="spellEnd"/>
+            <w:r>
+              <w:t xml:space="preserve"> is traceable.</w:t>
+            </w:r>
           </w:p>
         </w:tc>
         <w:tc>
@@ -9011,6 +9809,10 @@
             <w:pPr>
               <w:spacing w:before="50" w:after="50"/>
             </w:pPr>
+            <w:r>
+              <w:lastRenderedPageBreak/>
+              <w:t>Not provided; assume nothing beyond the ticket fields.</w:t>
+            </w:r>
           </w:p>
         </w:tc>
         <w:tc>
@@ -9028,6 +9830,9 @@
             <w:pPr>
               <w:spacing w:before="50" w:after="50"/>
             </w:pPr>
+            <w:r>
+              <w:t>Yes, name and id.</w:t>
+            </w:r>
           </w:p>
         </w:tc>
       </w:tr>
@@ -9324,10 +10129,10 @@
       </w:tblPr>
       <w:tblGrid>
         <w:gridCol w:w="2736"/>
-        <w:gridCol w:w="1152"/>
-        <w:gridCol w:w="1008"/>
-        <w:gridCol w:w="1728"/>
-        <w:gridCol w:w="3024"/>
+        <w:gridCol w:w="1375"/>
+        <w:gridCol w:w="1701"/>
+        <w:gridCol w:w="1701"/>
+        <w:gridCol w:w="2135"/>
       </w:tblGrid>
       <w:tr>
         <w:trPr>
@@ -9360,7 +10165,7 @@
         </w:tc>
         <w:tc>
           <w:tcPr>
-            <w:tcW w:w="1152" w:type="dxa"/>
+            <w:tcW w:w="1375" w:type="dxa"/>
             <w:tcBorders>
               <w:top w:val="single" w:sz="6" w:space="0" w:color="D9D9E0"/>
               <w:left w:val="single" w:sz="6" w:space="0" w:color="D9D9E0"/>
@@ -9385,7 +10190,7 @@
         </w:tc>
         <w:tc>
           <w:tcPr>
-            <w:tcW w:w="1008" w:type="dxa"/>
+            <w:tcW w:w="1701" w:type="dxa"/>
             <w:tcBorders>
               <w:top w:val="single" w:sz="6" w:space="0" w:color="D9D9E0"/>
               <w:left w:val="single" w:sz="6" w:space="0" w:color="D9D9E0"/>
@@ -9410,7 +10215,7 @@
         </w:tc>
         <w:tc>
           <w:tcPr>
-            <w:tcW w:w="1728" w:type="dxa"/>
+            <w:tcW w:w="1701" w:type="dxa"/>
             <w:tcBorders>
               <w:top w:val="single" w:sz="6" w:space="0" w:color="D9D9E0"/>
               <w:left w:val="single" w:sz="6" w:space="0" w:color="D9D9E0"/>
@@ -9435,7 +10240,7 @@
         </w:tc>
         <w:tc>
           <w:tcPr>
-            <w:tcW w:w="3024" w:type="dxa"/>
+            <w:tcW w:w="2135" w:type="dxa"/>
             <w:tcBorders>
               <w:top w:val="single" w:sz="6" w:space="0" w:color="D9D9E0"/>
               <w:left w:val="single" w:sz="6" w:space="0" w:color="D9D9E0"/>
@@ -9487,66 +10292,94 @@
         </w:tc>
         <w:tc>
           <w:tcPr>
-            <w:tcW w:w="1152" w:type="dxa"/>
-            <w:tcBorders>
-              <w:top w:val="single" w:sz="6" w:space="0" w:color="D9D9E0"/>
-              <w:left w:val="single" w:sz="6" w:space="0" w:color="D9D9E0"/>
-              <w:bottom w:val="single" w:sz="6" w:space="0" w:color="D9D9E0"/>
-              <w:right w:val="single" w:sz="6" w:space="0" w:color="D9D9E0"/>
-            </w:tcBorders>
-          </w:tcPr>
-          <w:p>
-            <w:pPr>
-              <w:spacing w:before="50" w:after="50"/>
-            </w:pPr>
-          </w:p>
-        </w:tc>
-        <w:tc>
-          <w:tcPr>
-            <w:tcW w:w="1008" w:type="dxa"/>
-            <w:tcBorders>
-              <w:top w:val="single" w:sz="6" w:space="0" w:color="D9D9E0"/>
-              <w:left w:val="single" w:sz="6" w:space="0" w:color="D9D9E0"/>
-              <w:bottom w:val="single" w:sz="6" w:space="0" w:color="D9D9E0"/>
-              <w:right w:val="single" w:sz="6" w:space="0" w:color="D9D9E0"/>
-            </w:tcBorders>
-          </w:tcPr>
-          <w:p>
-            <w:pPr>
-              <w:spacing w:before="50" w:after="50"/>
-            </w:pPr>
-          </w:p>
-        </w:tc>
-        <w:tc>
-          <w:tcPr>
-            <w:tcW w:w="1728" w:type="dxa"/>
-            <w:tcBorders>
-              <w:top w:val="single" w:sz="6" w:space="0" w:color="D9D9E0"/>
-              <w:left w:val="single" w:sz="6" w:space="0" w:color="D9D9E0"/>
-              <w:bottom w:val="single" w:sz="6" w:space="0" w:color="D9D9E0"/>
-              <w:right w:val="single" w:sz="6" w:space="0" w:color="D9D9E0"/>
-            </w:tcBorders>
-          </w:tcPr>
-          <w:p>
-            <w:pPr>
-              <w:spacing w:before="50" w:after="50"/>
-            </w:pPr>
-          </w:p>
-        </w:tc>
-        <w:tc>
-          <w:tcPr>
-            <w:tcW w:w="3024" w:type="dxa"/>
-            <w:tcBorders>
-              <w:top w:val="single" w:sz="6" w:space="0" w:color="D9D9E0"/>
-              <w:left w:val="single" w:sz="6" w:space="0" w:color="D9D9E0"/>
-              <w:bottom w:val="single" w:sz="6" w:space="0" w:color="D9D9E0"/>
-              <w:right w:val="single" w:sz="6" w:space="0" w:color="D9D9E0"/>
-            </w:tcBorders>
-          </w:tcPr>
-          <w:p>
-            <w:pPr>
-              <w:spacing w:before="50" w:after="50"/>
-            </w:pPr>
+            <w:tcW w:w="1375" w:type="dxa"/>
+            <w:tcBorders>
+              <w:top w:val="single" w:sz="6" w:space="0" w:color="D9D9E0"/>
+              <w:left w:val="single" w:sz="6" w:space="0" w:color="D9D9E0"/>
+              <w:bottom w:val="single" w:sz="6" w:space="0" w:color="D9D9E0"/>
+              <w:right w:val="single" w:sz="6" w:space="0" w:color="D9D9E0"/>
+            </w:tcBorders>
+          </w:tcPr>
+          <w:p>
+            <w:pPr>
+              <w:spacing w:before="50" w:after="50"/>
+            </w:pPr>
+            <w:r>
+              <w:t>High if unchecked; the model will fill gaps, and security tickets are only 54% answerable so retrieval can return something plausible.</w:t>
+            </w:r>
+          </w:p>
+        </w:tc>
+        <w:tc>
+          <w:tcPr>
+            <w:tcW w:w="1701" w:type="dxa"/>
+            <w:tcBorders>
+              <w:top w:val="single" w:sz="6" w:space="0" w:color="D9D9E0"/>
+              <w:left w:val="single" w:sz="6" w:space="0" w:color="D9D9E0"/>
+              <w:bottom w:val="single" w:sz="6" w:space="0" w:color="D9D9E0"/>
+              <w:right w:val="single" w:sz="6" w:space="0" w:color="D9D9E0"/>
+            </w:tcBorders>
+          </w:tcPr>
+          <w:p>
+            <w:pPr>
+              <w:spacing w:before="50" w:after="50"/>
+            </w:pPr>
+            <w:r>
+              <w:t>Severe. Marcus's first failure condition; customers "will screenshot a confidently incorrect answer and put it on the internet".</w:t>
+            </w:r>
+          </w:p>
+        </w:tc>
+        <w:tc>
+          <w:tcPr>
+            <w:tcW w:w="1701" w:type="dxa"/>
+            <w:tcBorders>
+              <w:top w:val="single" w:sz="6" w:space="0" w:color="D9D9E0"/>
+              <w:left w:val="single" w:sz="6" w:space="0" w:color="D9D9E0"/>
+              <w:bottom w:val="single" w:sz="6" w:space="0" w:color="D9D9E0"/>
+              <w:right w:val="single" w:sz="6" w:space="0" w:color="D9D9E0"/>
+            </w:tcBorders>
+          </w:tcPr>
+          <w:p>
+            <w:pPr>
+              <w:spacing w:before="50" w:after="50"/>
+            </w:pPr>
+            <w:r>
+              <w:t>The customer who acts on it (Ravi: "I will act on it and break something"), then the agent who picks up the follow-up (Sofia).</w:t>
+            </w:r>
+          </w:p>
+        </w:tc>
+        <w:tc>
+          <w:tcPr>
+            <w:tcW w:w="2135" w:type="dxa"/>
+            <w:tcBorders>
+              <w:top w:val="single" w:sz="6" w:space="0" w:color="D9D9E0"/>
+              <w:left w:val="single" w:sz="6" w:space="0" w:color="D9D9E0"/>
+              <w:bottom w:val="single" w:sz="6" w:space="0" w:color="D9D9E0"/>
+              <w:right w:val="single" w:sz="6" w:space="0" w:color="D9D9E0"/>
+            </w:tcBorders>
+          </w:tcPr>
+          <w:p>
+            <w:pPr>
+              <w:spacing w:before="50" w:after="50"/>
+            </w:pPr>
+            <w:r>
+              <w:t xml:space="preserve">1) Answer only from a retrieved article, with the article id. </w:t>
+            </w:r>
+          </w:p>
+          <w:p>
+            <w:pPr>
+              <w:spacing w:before="50" w:after="50"/>
+            </w:pPr>
+            <w:r>
+              <w:t xml:space="preserve">2) Calibrated confidence and a measured threshold. 3) Escalate when unsure. </w:t>
+            </w:r>
+          </w:p>
+          <w:p>
+            <w:pPr>
+              <w:spacing w:before="50" w:after="50"/>
+            </w:pPr>
+            <w:r>
+              <w:t>4) Tell the customer it is automated (Ravi).</w:t>
+            </w:r>
           </w:p>
         </w:tc>
       </w:tr>
@@ -9579,7 +10412,7 @@
         </w:tc>
         <w:tc>
           <w:tcPr>
-            <w:tcW w:w="1152" w:type="dxa"/>
+            <w:tcW w:w="1375" w:type="dxa"/>
             <w:tcBorders>
               <w:top w:val="single" w:sz="6" w:space="0" w:color="D9D9E0"/>
               <w:left w:val="single" w:sz="6" w:space="0" w:color="D9D9E0"/>
@@ -9592,11 +10425,14 @@
             <w:pPr>
               <w:spacing w:before="50" w:after="50"/>
             </w:pPr>
-          </w:p>
-        </w:tc>
-        <w:tc>
-          <w:tcPr>
-            <w:tcW w:w="1008" w:type="dxa"/>
+            <w:r>
+              <w:t>Medium. Name and id sit on every ticket and the model sees them.</w:t>
+            </w:r>
+          </w:p>
+        </w:tc>
+        <w:tc>
+          <w:tcPr>
+            <w:tcW w:w="1701" w:type="dxa"/>
             <w:tcBorders>
               <w:top w:val="single" w:sz="6" w:space="0" w:color="D9D9E0"/>
               <w:left w:val="single" w:sz="6" w:space="0" w:color="D9D9E0"/>
@@ -9609,11 +10445,14 @@
             <w:pPr>
               <w:spacing w:before="50" w:after="50"/>
             </w:pPr>
-          </w:p>
-        </w:tc>
-        <w:tc>
-          <w:tcPr>
-            <w:tcW w:w="1728" w:type="dxa"/>
+            <w:r>
+              <w:t>Severe. Governance condition is zero occurrences.</w:t>
+            </w:r>
+          </w:p>
+        </w:tc>
+        <w:tc>
+          <w:tcPr>
+            <w:tcW w:w="1701" w:type="dxa"/>
             <w:tcBorders>
               <w:top w:val="single" w:sz="6" w:space="0" w:color="D9D9E0"/>
               <w:left w:val="single" w:sz="6" w:space="0" w:color="D9D9E0"/>
@@ -9626,11 +10465,22 @@
             <w:pPr>
               <w:spacing w:before="50" w:after="50"/>
             </w:pPr>
-          </w:p>
-        </w:tc>
-        <w:tc>
-          <w:tcPr>
-            <w:tcW w:w="3024" w:type="dxa"/>
+            <w:r>
+              <w:t xml:space="preserve">The customer whose data leaks; </w:t>
+            </w:r>
+            <w:proofErr w:type="spellStart"/>
+            <w:r>
+              <w:t>CloudServe's</w:t>
+            </w:r>
+            <w:proofErr w:type="spellEnd"/>
+            <w:r>
+              <w:t xml:space="preserve"> autumn compliance review.</w:t>
+            </w:r>
+          </w:p>
+        </w:tc>
+        <w:tc>
+          <w:tcPr>
+            <w:tcW w:w="2135" w:type="dxa"/>
             <w:tcBorders>
               <w:top w:val="single" w:sz="6" w:space="0" w:color="D9D9E0"/>
               <w:left w:val="single" w:sz="6" w:space="0" w:color="D9D9E0"/>
@@ -9643,6 +10493,17 @@
             <w:pPr>
               <w:spacing w:before="50" w:after="50"/>
             </w:pPr>
+            <w:r>
+              <w:t xml:space="preserve">1) Never pass ticket fields into the reply. 2) Scan every outbound draft. </w:t>
+            </w:r>
+          </w:p>
+          <w:p>
+            <w:pPr>
+              <w:spacing w:before="50" w:after="50"/>
+            </w:pPr>
+            <w:r>
+              <w:t>3) Block and escalate, never redact and send.</w:t>
+            </w:r>
           </w:p>
         </w:tc>
       </w:tr>
@@ -9674,66 +10535,139 @@
         </w:tc>
         <w:tc>
           <w:tcPr>
-            <w:tcW w:w="1152" w:type="dxa"/>
-            <w:tcBorders>
-              <w:top w:val="single" w:sz="6" w:space="0" w:color="D9D9E0"/>
-              <w:left w:val="single" w:sz="6" w:space="0" w:color="D9D9E0"/>
-              <w:bottom w:val="single" w:sz="6" w:space="0" w:color="D9D9E0"/>
-              <w:right w:val="single" w:sz="6" w:space="0" w:color="D9D9E0"/>
-            </w:tcBorders>
-          </w:tcPr>
-          <w:p>
-            <w:pPr>
-              <w:spacing w:before="50" w:after="50"/>
-            </w:pPr>
-          </w:p>
-        </w:tc>
-        <w:tc>
-          <w:tcPr>
-            <w:tcW w:w="1008" w:type="dxa"/>
-            <w:tcBorders>
-              <w:top w:val="single" w:sz="6" w:space="0" w:color="D9D9E0"/>
-              <w:left w:val="single" w:sz="6" w:space="0" w:color="D9D9E0"/>
-              <w:bottom w:val="single" w:sz="6" w:space="0" w:color="D9D9E0"/>
-              <w:right w:val="single" w:sz="6" w:space="0" w:color="D9D9E0"/>
-            </w:tcBorders>
-          </w:tcPr>
-          <w:p>
-            <w:pPr>
-              <w:spacing w:before="50" w:after="50"/>
-            </w:pPr>
-          </w:p>
-        </w:tc>
-        <w:tc>
-          <w:tcPr>
-            <w:tcW w:w="1728" w:type="dxa"/>
-            <w:tcBorders>
-              <w:top w:val="single" w:sz="6" w:space="0" w:color="D9D9E0"/>
-              <w:left w:val="single" w:sz="6" w:space="0" w:color="D9D9E0"/>
-              <w:bottom w:val="single" w:sz="6" w:space="0" w:color="D9D9E0"/>
-              <w:right w:val="single" w:sz="6" w:space="0" w:color="D9D9E0"/>
-            </w:tcBorders>
-          </w:tcPr>
-          <w:p>
-            <w:pPr>
-              <w:spacing w:before="50" w:after="50"/>
-            </w:pPr>
-          </w:p>
-        </w:tc>
-        <w:tc>
-          <w:tcPr>
-            <w:tcW w:w="3024" w:type="dxa"/>
-            <w:tcBorders>
-              <w:top w:val="single" w:sz="6" w:space="0" w:color="D9D9E0"/>
-              <w:left w:val="single" w:sz="6" w:space="0" w:color="D9D9E0"/>
-              <w:bottom w:val="single" w:sz="6" w:space="0" w:color="D9D9E0"/>
-              <w:right w:val="single" w:sz="6" w:space="0" w:color="D9D9E0"/>
-            </w:tcBorders>
-          </w:tcPr>
-          <w:p>
-            <w:pPr>
-              <w:spacing w:before="50" w:after="50"/>
-            </w:pPr>
+            <w:tcW w:w="1375" w:type="dxa"/>
+            <w:tcBorders>
+              <w:top w:val="single" w:sz="6" w:space="0" w:color="D9D9E0"/>
+              <w:left w:val="single" w:sz="6" w:space="0" w:color="D9D9E0"/>
+              <w:bottom w:val="single" w:sz="6" w:space="0" w:color="D9D9E0"/>
+              <w:right w:val="single" w:sz="6" w:space="0" w:color="D9D9E0"/>
+            </w:tcBorders>
+          </w:tcPr>
+          <w:p>
+            <w:pPr>
+              <w:spacing w:before="50" w:after="50"/>
+            </w:pPr>
+            <w:r>
+              <w:t xml:space="preserve"> Medium. Human baseline shows little </w:t>
+            </w:r>
+            <w:r>
+              <w:lastRenderedPageBreak/>
+              <w:t xml:space="preserve">fluency gap, but the Governance Framework says retrieval systems usually do worse on non-fluent phrasing; </w:t>
+            </w:r>
+            <w:proofErr w:type="spellStart"/>
+            <w:r>
+              <w:t>latin_america</w:t>
+            </w:r>
+            <w:proofErr w:type="spellEnd"/>
+            <w:r>
+              <w:t xml:space="preserve"> already has the lowest CSAT (2.73) and </w:t>
+            </w:r>
+            <w:proofErr w:type="spellStart"/>
+            <w:r>
+              <w:t>asia_pacific</w:t>
+            </w:r>
+            <w:proofErr w:type="spellEnd"/>
+            <w:r>
+              <w:t xml:space="preserve"> the lowest FCR (39.5%).</w:t>
+            </w:r>
+          </w:p>
+        </w:tc>
+        <w:tc>
+          <w:tcPr>
+            <w:tcW w:w="1701" w:type="dxa"/>
+            <w:tcBorders>
+              <w:top w:val="single" w:sz="6" w:space="0" w:color="D9D9E0"/>
+              <w:left w:val="single" w:sz="6" w:space="0" w:color="D9D9E0"/>
+              <w:bottom w:val="single" w:sz="6" w:space="0" w:color="D9D9E0"/>
+              <w:right w:val="single" w:sz="6" w:space="0" w:color="D9D9E0"/>
+            </w:tcBorders>
+          </w:tcPr>
+          <w:p>
+            <w:pPr>
+              <w:spacing w:before="50" w:after="50"/>
+              <w:jc w:val="center"/>
+            </w:pPr>
+            <w:r>
+              <w:lastRenderedPageBreak/>
+              <w:t xml:space="preserve"> High. Renewal risk; </w:t>
+            </w:r>
+          </w:p>
+          <w:p>
+            <w:pPr>
+              <w:spacing w:before="50" w:after="50"/>
+              <w:jc w:val="center"/>
+            </w:pPr>
+            <w:r>
+              <w:t xml:space="preserve">fairness condition is </w:t>
+            </w:r>
+            <w:r>
+              <w:lastRenderedPageBreak/>
+              <w:t>under 5 points variation.</w:t>
+            </w:r>
+          </w:p>
+        </w:tc>
+        <w:tc>
+          <w:tcPr>
+            <w:tcW w:w="1701" w:type="dxa"/>
+            <w:tcBorders>
+              <w:top w:val="single" w:sz="6" w:space="0" w:color="D9D9E0"/>
+              <w:left w:val="single" w:sz="6" w:space="0" w:color="D9D9E0"/>
+              <w:bottom w:val="single" w:sz="6" w:space="0" w:color="D9D9E0"/>
+              <w:right w:val="single" w:sz="6" w:space="0" w:color="D9D9E0"/>
+            </w:tcBorders>
+          </w:tcPr>
+          <w:p>
+            <w:pPr>
+              <w:spacing w:before="50" w:after="50"/>
+            </w:pPr>
+            <w:r>
+              <w:lastRenderedPageBreak/>
+              <w:t xml:space="preserve">Non-fluent customers, standard tier, </w:t>
+            </w:r>
+            <w:proofErr w:type="spellStart"/>
+            <w:r>
+              <w:t>latin_america</w:t>
+            </w:r>
+            <w:proofErr w:type="spellEnd"/>
+            <w:r>
+              <w:t xml:space="preserve"> </w:t>
+            </w:r>
+            <w:r>
+              <w:lastRenderedPageBreak/>
+              <w:t xml:space="preserve">and </w:t>
+            </w:r>
+            <w:proofErr w:type="spellStart"/>
+            <w:r>
+              <w:t>asia_pacific</w:t>
+            </w:r>
+            <w:proofErr w:type="spellEnd"/>
+            <w:r>
+              <w:t xml:space="preserve"> regions.</w:t>
+            </w:r>
+          </w:p>
+        </w:tc>
+        <w:tc>
+          <w:tcPr>
+            <w:tcW w:w="2135" w:type="dxa"/>
+            <w:tcBorders>
+              <w:top w:val="single" w:sz="6" w:space="0" w:color="D9D9E0"/>
+              <w:left w:val="single" w:sz="6" w:space="0" w:color="D9D9E0"/>
+              <w:bottom w:val="single" w:sz="6" w:space="0" w:color="D9D9E0"/>
+              <w:right w:val="single" w:sz="6" w:space="0" w:color="D9D9E0"/>
+            </w:tcBorders>
+          </w:tcPr>
+          <w:p>
+            <w:pPr>
+              <w:spacing w:before="50" w:after="50"/>
+            </w:pPr>
+            <w:r>
+              <w:lastRenderedPageBreak/>
+              <w:t xml:space="preserve">Measure the system's output by fluency, tier and region against the human baseline </w:t>
+            </w:r>
+            <w:r>
+              <w:lastRenderedPageBreak/>
+              <w:t>before launch, not after.</w:t>
+            </w:r>
           </w:p>
         </w:tc>
       </w:tr>
@@ -9766,7 +10700,7 @@
         </w:tc>
         <w:tc>
           <w:tcPr>
-            <w:tcW w:w="1152" w:type="dxa"/>
+            <w:tcW w:w="1375" w:type="dxa"/>
             <w:tcBorders>
               <w:top w:val="single" w:sz="6" w:space="0" w:color="D9D9E0"/>
               <w:left w:val="single" w:sz="6" w:space="0" w:color="D9D9E0"/>
@@ -9779,11 +10713,14 @@
             <w:pPr>
               <w:spacing w:before="50" w:after="50"/>
             </w:pPr>
-          </w:p>
-        </w:tc>
-        <w:tc>
-          <w:tcPr>
-            <w:tcW w:w="1008" w:type="dxa"/>
+            <w:r>
+              <w:t>Medium. No freshness field exists; Ines reviews on rotation by hand.</w:t>
+            </w:r>
+          </w:p>
+        </w:tc>
+        <w:tc>
+          <w:tcPr>
+            <w:tcW w:w="1701" w:type="dxa"/>
             <w:tcBorders>
               <w:top w:val="single" w:sz="6" w:space="0" w:color="D9D9E0"/>
               <w:left w:val="single" w:sz="6" w:space="0" w:color="D9D9E0"/>
@@ -9796,11 +10733,14 @@
             <w:pPr>
               <w:spacing w:before="50" w:after="50"/>
             </w:pPr>
-          </w:p>
-        </w:tc>
-        <w:tc>
-          <w:tcPr>
-            <w:tcW w:w="1728" w:type="dxa"/>
+            <w:r>
+              <w:t>High. A stale article becomes a scaled mistake (Daniel).</w:t>
+            </w:r>
+          </w:p>
+        </w:tc>
+        <w:tc>
+          <w:tcPr>
+            <w:tcW w:w="1701" w:type="dxa"/>
             <w:tcBorders>
               <w:top w:val="single" w:sz="6" w:space="0" w:color="D9D9E0"/>
               <w:left w:val="single" w:sz="6" w:space="0" w:color="D9D9E0"/>
@@ -9813,11 +10753,14 @@
             <w:pPr>
               <w:spacing w:before="50" w:after="50"/>
             </w:pPr>
-          </w:p>
-        </w:tc>
-        <w:tc>
-          <w:tcPr>
-            <w:tcW w:w="3024" w:type="dxa"/>
+            <w:r>
+              <w:t>Every customer on the affected intent; Ines, who must find the fault.</w:t>
+            </w:r>
+          </w:p>
+        </w:tc>
+        <w:tc>
+          <w:tcPr>
+            <w:tcW w:w="2135" w:type="dxa"/>
             <w:tcBorders>
               <w:top w:val="single" w:sz="6" w:space="0" w:color="D9D9E0"/>
               <w:left w:val="single" w:sz="6" w:space="0" w:color="D9D9E0"/>
@@ -9830,6 +10773,25 @@
             <w:pPr>
               <w:spacing w:before="50" w:after="50"/>
             </w:pPr>
+            <w:r>
+              <w:t xml:space="preserve"> 1) Retrieve only from the 29 reviewed articles, never private files. </w:t>
+            </w:r>
+          </w:p>
+          <w:p>
+            <w:pPr>
+              <w:spacing w:before="50" w:after="50"/>
+            </w:pPr>
+            <w:r>
+              <w:t xml:space="preserve">2) Log the article id on every answer so Ines can tell an article error from a system error. </w:t>
+            </w:r>
+          </w:p>
+          <w:p>
+            <w:pPr>
+              <w:spacing w:before="50" w:after="50"/>
+            </w:pPr>
+            <w:r>
+              <w:t>3) Flag articles by age once a review date exists.</w:t>
+            </w:r>
           </w:p>
         </w:tc>
       </w:tr>
@@ -9850,71 +10812,96 @@
           <w:p>
             <w:pPr>
               <w:spacing w:before="50" w:after="50"/>
-            </w:pPr>
-          </w:p>
-        </w:tc>
-        <w:tc>
-          <w:tcPr>
-            <w:tcW w:w="1152" w:type="dxa"/>
-            <w:tcBorders>
-              <w:top w:val="single" w:sz="6" w:space="0" w:color="D9D9E0"/>
-              <w:left w:val="single" w:sz="6" w:space="0" w:color="D9D9E0"/>
-              <w:bottom w:val="single" w:sz="6" w:space="0" w:color="D9D9E0"/>
-              <w:right w:val="single" w:sz="6" w:space="0" w:color="D9D9E0"/>
-            </w:tcBorders>
-          </w:tcPr>
-          <w:p>
-            <w:pPr>
-              <w:spacing w:before="50" w:after="50"/>
-            </w:pPr>
-          </w:p>
-        </w:tc>
-        <w:tc>
-          <w:tcPr>
-            <w:tcW w:w="1008" w:type="dxa"/>
-            <w:tcBorders>
-              <w:top w:val="single" w:sz="6" w:space="0" w:color="D9D9E0"/>
-              <w:left w:val="single" w:sz="6" w:space="0" w:color="D9D9E0"/>
-              <w:bottom w:val="single" w:sz="6" w:space="0" w:color="D9D9E0"/>
-              <w:right w:val="single" w:sz="6" w:space="0" w:color="D9D9E0"/>
-            </w:tcBorders>
-          </w:tcPr>
-          <w:p>
-            <w:pPr>
-              <w:spacing w:before="50" w:after="50"/>
-            </w:pPr>
-          </w:p>
-        </w:tc>
-        <w:tc>
-          <w:tcPr>
-            <w:tcW w:w="1728" w:type="dxa"/>
-            <w:tcBorders>
-              <w:top w:val="single" w:sz="6" w:space="0" w:color="D9D9E0"/>
-              <w:left w:val="single" w:sz="6" w:space="0" w:color="D9D9E0"/>
-              <w:bottom w:val="single" w:sz="6" w:space="0" w:color="D9D9E0"/>
-              <w:right w:val="single" w:sz="6" w:space="0" w:color="D9D9E0"/>
-            </w:tcBorders>
-          </w:tcPr>
-          <w:p>
-            <w:pPr>
-              <w:spacing w:before="50" w:after="50"/>
-            </w:pPr>
-          </w:p>
-        </w:tc>
-        <w:tc>
-          <w:tcPr>
-            <w:tcW w:w="3024" w:type="dxa"/>
-            <w:tcBorders>
-              <w:top w:val="single" w:sz="6" w:space="0" w:color="D9D9E0"/>
-              <w:left w:val="single" w:sz="6" w:space="0" w:color="D9D9E0"/>
-              <w:bottom w:val="single" w:sz="6" w:space="0" w:color="D9D9E0"/>
-              <w:right w:val="single" w:sz="6" w:space="0" w:color="D9D9E0"/>
-            </w:tcBorders>
-          </w:tcPr>
-          <w:p>
-            <w:pPr>
-              <w:spacing w:before="50" w:after="50"/>
-            </w:pPr>
+              <w:rPr>
+                <w:sz w:val="16"/>
+                <w:szCs w:val="16"/>
+              </w:rPr>
+            </w:pPr>
+            <w:r>
+              <w:rPr>
+                <w:b/>
+                <w:bCs/>
+                <w:sz w:val="16"/>
+                <w:szCs w:val="16"/>
+              </w:rPr>
+              <w:t>A never-auto ticket is answered automatically</w:t>
+            </w:r>
+          </w:p>
+        </w:tc>
+        <w:tc>
+          <w:tcPr>
+            <w:tcW w:w="1375" w:type="dxa"/>
+            <w:tcBorders>
+              <w:top w:val="single" w:sz="6" w:space="0" w:color="D9D9E0"/>
+              <w:left w:val="single" w:sz="6" w:space="0" w:color="D9D9E0"/>
+              <w:bottom w:val="single" w:sz="6" w:space="0" w:color="D9D9E0"/>
+              <w:right w:val="single" w:sz="6" w:space="0" w:color="D9D9E0"/>
+            </w:tcBorders>
+          </w:tcPr>
+          <w:p>
+            <w:pPr>
+              <w:spacing w:before="50" w:after="50"/>
+            </w:pPr>
+            <w:r>
+              <w:t>Medium; 17.4% of tickets are in these four intents</w:t>
+            </w:r>
+          </w:p>
+        </w:tc>
+        <w:tc>
+          <w:tcPr>
+            <w:tcW w:w="1701" w:type="dxa"/>
+            <w:tcBorders>
+              <w:top w:val="single" w:sz="6" w:space="0" w:color="D9D9E0"/>
+              <w:left w:val="single" w:sz="6" w:space="0" w:color="D9D9E0"/>
+              <w:bottom w:val="single" w:sz="6" w:space="0" w:color="D9D9E0"/>
+              <w:right w:val="single" w:sz="6" w:space="0" w:color="D9D9E0"/>
+            </w:tcBorders>
+          </w:tcPr>
+          <w:p>
+            <w:pPr>
+              <w:spacing w:before="50" w:after="50"/>
+            </w:pPr>
+            <w:r>
+              <w:t>Severe; the Dataset Guide calls it a governance failure, not a scoring loss. </w:t>
+            </w:r>
+          </w:p>
+        </w:tc>
+        <w:tc>
+          <w:tcPr>
+            <w:tcW w:w="1701" w:type="dxa"/>
+            <w:tcBorders>
+              <w:top w:val="single" w:sz="6" w:space="0" w:color="D9D9E0"/>
+              <w:left w:val="single" w:sz="6" w:space="0" w:color="D9D9E0"/>
+              <w:bottom w:val="single" w:sz="6" w:space="0" w:color="D9D9E0"/>
+              <w:right w:val="single" w:sz="6" w:space="0" w:color="D9D9E0"/>
+            </w:tcBorders>
+          </w:tcPr>
+          <w:p>
+            <w:pPr>
+              <w:spacing w:before="50" w:after="50"/>
+            </w:pPr>
+            <w:r>
+              <w:t>customers, compliance</w:t>
+            </w:r>
+          </w:p>
+        </w:tc>
+        <w:tc>
+          <w:tcPr>
+            <w:tcW w:w="2135" w:type="dxa"/>
+            <w:tcBorders>
+              <w:top w:val="single" w:sz="6" w:space="0" w:color="D9D9E0"/>
+              <w:left w:val="single" w:sz="6" w:space="0" w:color="D9D9E0"/>
+              <w:bottom w:val="single" w:sz="6" w:space="0" w:color="D9D9E0"/>
+              <w:right w:val="single" w:sz="6" w:space="0" w:color="D9D9E0"/>
+            </w:tcBorders>
+          </w:tcPr>
+          <w:p>
+            <w:pPr>
+              <w:spacing w:before="50" w:after="50"/>
+            </w:pPr>
+            <w:r>
+              <w:t>hard rule that compliance, security, feature and unclear intents escalate regardless of confidence; low-confidence classification also escalates.</w:t>
+            </w:r>
           </w:p>
         </w:tc>
       </w:tr>
@@ -9936,12 +10923,28 @@
           <w:p>
             <w:pPr>
               <w:spacing w:before="50" w:after="50"/>
-            </w:pPr>
-          </w:p>
-        </w:tc>
-        <w:tc>
-          <w:tcPr>
-            <w:tcW w:w="1152" w:type="dxa"/>
+              <w:jc w:val="center"/>
+            </w:pPr>
+            <w:r>
+              <w:rPr>
+                <w:b/>
+                <w:bCs/>
+              </w:rPr>
+              <w:t xml:space="preserve">The system makes a </w:t>
+            </w:r>
+            <w:r>
+              <w:rPr>
+                <w:b/>
+                <w:bCs/>
+              </w:rPr>
+              <w:lastRenderedPageBreak/>
+              <w:t>commitment about money or timing</w:t>
+            </w:r>
+          </w:p>
+        </w:tc>
+        <w:tc>
+          <w:tcPr>
+            <w:tcW w:w="1375" w:type="dxa"/>
             <w:tcBorders>
               <w:top w:val="single" w:sz="6" w:space="0" w:color="D9D9E0"/>
               <w:left w:val="single" w:sz="6" w:space="0" w:color="D9D9E0"/>
@@ -9954,11 +10957,19 @@
             <w:pPr>
               <w:spacing w:before="50" w:after="50"/>
             </w:pPr>
-          </w:p>
-        </w:tc>
-        <w:tc>
-          <w:tcPr>
-            <w:tcW w:w="1008" w:type="dxa"/>
+            <w:r>
+              <w:lastRenderedPageBreak/>
+              <w:t xml:space="preserve">Medium; </w:t>
+            </w:r>
+            <w:r>
+              <w:lastRenderedPageBreak/>
+              <w:t>billing (87.5%) and data residency (72.4%) are labelled answerable.</w:t>
+            </w:r>
+          </w:p>
+        </w:tc>
+        <w:tc>
+          <w:tcPr>
+            <w:tcW w:w="1701" w:type="dxa"/>
             <w:tcBorders>
               <w:top w:val="single" w:sz="6" w:space="0" w:color="D9D9E0"/>
               <w:left w:val="single" w:sz="6" w:space="0" w:color="D9D9E0"/>
@@ -9971,11 +10982,19 @@
             <w:pPr>
               <w:spacing w:before="50" w:after="50"/>
             </w:pPr>
-          </w:p>
-        </w:tc>
-        <w:tc>
-          <w:tcPr>
-            <w:tcW w:w="1728" w:type="dxa"/>
+            <w:r>
+              <w:lastRenderedPageBreak/>
+              <w:t xml:space="preserve">High; Daniel: </w:t>
+            </w:r>
+            <w:r>
+              <w:lastRenderedPageBreak/>
+              <w:t>"those become contractual quickly".</w:t>
+            </w:r>
+          </w:p>
+        </w:tc>
+        <w:tc>
+          <w:tcPr>
+            <w:tcW w:w="1701" w:type="dxa"/>
             <w:tcBorders>
               <w:top w:val="single" w:sz="6" w:space="0" w:color="D9D9E0"/>
               <w:left w:val="single" w:sz="6" w:space="0" w:color="D9D9E0"/>
@@ -9988,11 +11007,27 @@
             <w:pPr>
               <w:spacing w:before="50" w:after="50"/>
             </w:pPr>
-          </w:p>
-        </w:tc>
-        <w:tc>
-          <w:tcPr>
-            <w:tcW w:w="3024" w:type="dxa"/>
+            <w:r>
+              <w:lastRenderedPageBreak/>
+              <w:t> </w:t>
+            </w:r>
+            <w:proofErr w:type="spellStart"/>
+            <w:r>
+              <w:t>CloudServe</w:t>
+            </w:r>
+            <w:proofErr w:type="spellEnd"/>
+            <w:r>
+              <w:t xml:space="preserve"> </w:t>
+            </w:r>
+            <w:r>
+              <w:lastRenderedPageBreak/>
+              <w:t>commercially.</w:t>
+            </w:r>
+          </w:p>
+        </w:tc>
+        <w:tc>
+          <w:tcPr>
+            <w:tcW w:w="2135" w:type="dxa"/>
             <w:tcBorders>
               <w:top w:val="single" w:sz="6" w:space="0" w:color="D9D9E0"/>
               <w:left w:val="single" w:sz="6" w:space="0" w:color="D9D9E0"/>
@@ -10005,6 +11040,14 @@
             <w:pPr>
               <w:spacing w:before="50" w:after="50"/>
             </w:pPr>
+            <w:r>
+              <w:lastRenderedPageBreak/>
+              <w:t xml:space="preserve"> block any reply </w:t>
+            </w:r>
+            <w:r>
+              <w:lastRenderedPageBreak/>
+              <w:t>containing the three universal forbidden claims: a refund issued, fixed on our side, a delivery date.</w:t>
+            </w:r>
           </w:p>
         </w:tc>
       </w:tr>
@@ -10025,71 +11068,98 @@
           <w:p>
             <w:pPr>
               <w:spacing w:before="50" w:after="50"/>
-            </w:pPr>
-          </w:p>
-        </w:tc>
-        <w:tc>
-          <w:tcPr>
-            <w:tcW w:w="1152" w:type="dxa"/>
-            <w:tcBorders>
-              <w:top w:val="single" w:sz="6" w:space="0" w:color="D9D9E0"/>
-              <w:left w:val="single" w:sz="6" w:space="0" w:color="D9D9E0"/>
-              <w:bottom w:val="single" w:sz="6" w:space="0" w:color="D9D9E0"/>
-              <w:right w:val="single" w:sz="6" w:space="0" w:color="D9D9E0"/>
-            </w:tcBorders>
-          </w:tcPr>
-          <w:p>
-            <w:pPr>
-              <w:spacing w:before="50" w:after="50"/>
-            </w:pPr>
-          </w:p>
-        </w:tc>
-        <w:tc>
-          <w:tcPr>
-            <w:tcW w:w="1008" w:type="dxa"/>
-            <w:tcBorders>
-              <w:top w:val="single" w:sz="6" w:space="0" w:color="D9D9E0"/>
-              <w:left w:val="single" w:sz="6" w:space="0" w:color="D9D9E0"/>
-              <w:bottom w:val="single" w:sz="6" w:space="0" w:color="D9D9E0"/>
-              <w:right w:val="single" w:sz="6" w:space="0" w:color="D9D9E0"/>
-            </w:tcBorders>
-          </w:tcPr>
-          <w:p>
-            <w:pPr>
-              <w:spacing w:before="50" w:after="50"/>
-            </w:pPr>
-          </w:p>
-        </w:tc>
-        <w:tc>
-          <w:tcPr>
-            <w:tcW w:w="1728" w:type="dxa"/>
-            <w:tcBorders>
-              <w:top w:val="single" w:sz="6" w:space="0" w:color="D9D9E0"/>
-              <w:left w:val="single" w:sz="6" w:space="0" w:color="D9D9E0"/>
-              <w:bottom w:val="single" w:sz="6" w:space="0" w:color="D9D9E0"/>
-              <w:right w:val="single" w:sz="6" w:space="0" w:color="D9D9E0"/>
-            </w:tcBorders>
-          </w:tcPr>
-          <w:p>
-            <w:pPr>
-              <w:spacing w:before="50" w:after="50"/>
-            </w:pPr>
-          </w:p>
-        </w:tc>
-        <w:tc>
-          <w:tcPr>
-            <w:tcW w:w="3024" w:type="dxa"/>
-            <w:tcBorders>
-              <w:top w:val="single" w:sz="6" w:space="0" w:color="D9D9E0"/>
-              <w:left w:val="single" w:sz="6" w:space="0" w:color="D9D9E0"/>
-              <w:bottom w:val="single" w:sz="6" w:space="0" w:color="D9D9E0"/>
-              <w:right w:val="single" w:sz="6" w:space="0" w:color="D9D9E0"/>
-            </w:tcBorders>
-          </w:tcPr>
-          <w:p>
-            <w:pPr>
-              <w:spacing w:before="50" w:after="50"/>
-            </w:pPr>
+              <w:jc w:val="center"/>
+            </w:pPr>
+            <w:r>
+              <w:rPr>
+                <w:b/>
+                <w:bCs/>
+              </w:rPr>
+              <w:t>Escalations arrive without context</w:t>
+            </w:r>
+          </w:p>
+        </w:tc>
+        <w:tc>
+          <w:tcPr>
+            <w:tcW w:w="1375" w:type="dxa"/>
+            <w:tcBorders>
+              <w:top w:val="single" w:sz="6" w:space="0" w:color="D9D9E0"/>
+              <w:left w:val="single" w:sz="6" w:space="0" w:color="D9D9E0"/>
+              <w:bottom w:val="single" w:sz="6" w:space="0" w:color="D9D9E0"/>
+              <w:right w:val="single" w:sz="6" w:space="0" w:color="D9D9E0"/>
+            </w:tcBorders>
+          </w:tcPr>
+          <w:p>
+            <w:pPr>
+              <w:spacing w:before="50" w:after="50"/>
+            </w:pPr>
+            <w:proofErr w:type="spellStart"/>
+            <w:proofErr w:type="gramStart"/>
+            <w:r>
+              <w:t>High;it</w:t>
+            </w:r>
+            <w:proofErr w:type="spellEnd"/>
+            <w:proofErr w:type="gramEnd"/>
+            <w:r>
+              <w:t xml:space="preserve"> is how it works today.</w:t>
+            </w:r>
+          </w:p>
+        </w:tc>
+        <w:tc>
+          <w:tcPr>
+            <w:tcW w:w="1701" w:type="dxa"/>
+            <w:tcBorders>
+              <w:top w:val="single" w:sz="6" w:space="0" w:color="D9D9E0"/>
+              <w:left w:val="single" w:sz="6" w:space="0" w:color="D9D9E0"/>
+              <w:bottom w:val="single" w:sz="6" w:space="0" w:color="D9D9E0"/>
+              <w:right w:val="single" w:sz="6" w:space="0" w:color="D9D9E0"/>
+            </w:tcBorders>
+          </w:tcPr>
+          <w:p>
+            <w:pPr>
+              <w:spacing w:before="50" w:after="50"/>
+            </w:pPr>
+            <w:r>
+              <w:t>Medium; the project fails to reduce workload, Marcus's second failure.</w:t>
+            </w:r>
+          </w:p>
+        </w:tc>
+        <w:tc>
+          <w:tcPr>
+            <w:tcW w:w="1701" w:type="dxa"/>
+            <w:tcBorders>
+              <w:top w:val="single" w:sz="6" w:space="0" w:color="D9D9E0"/>
+              <w:left w:val="single" w:sz="6" w:space="0" w:color="D9D9E0"/>
+              <w:bottom w:val="single" w:sz="6" w:space="0" w:color="D9D9E0"/>
+              <w:right w:val="single" w:sz="6" w:space="0" w:color="D9D9E0"/>
+            </w:tcBorders>
+          </w:tcPr>
+          <w:p>
+            <w:pPr>
+              <w:spacing w:before="50" w:after="50"/>
+            </w:pPr>
+            <w:r>
+              <w:t> tier two and the customers re-asked questions.</w:t>
+            </w:r>
+          </w:p>
+        </w:tc>
+        <w:tc>
+          <w:tcPr>
+            <w:tcW w:w="2135" w:type="dxa"/>
+            <w:tcBorders>
+              <w:top w:val="single" w:sz="6" w:space="0" w:color="D9D9E0"/>
+              <w:left w:val="single" w:sz="6" w:space="0" w:color="D9D9E0"/>
+              <w:bottom w:val="single" w:sz="6" w:space="0" w:color="D9D9E0"/>
+              <w:right w:val="single" w:sz="6" w:space="0" w:color="D9D9E0"/>
+            </w:tcBorders>
+          </w:tcPr>
+          <w:p>
+            <w:pPr>
+              <w:spacing w:before="50" w:after="50"/>
+            </w:pPr>
+            <w:r>
+              <w:t>every escalation carries the draft, retrieved sources and what the system was unsure about.</w:t>
+            </w:r>
           </w:p>
         </w:tc>
       </w:tr>
@@ -10111,12 +11181,20 @@
           <w:p>
             <w:pPr>
               <w:spacing w:before="50" w:after="50"/>
-            </w:pPr>
-          </w:p>
-        </w:tc>
-        <w:tc>
-          <w:tcPr>
-            <w:tcW w:w="1152" w:type="dxa"/>
+              <w:jc w:val="center"/>
+            </w:pPr>
+            <w:r>
+              <w:rPr>
+                <w:b/>
+                <w:bCs/>
+              </w:rPr>
+              <w:t>The system makes more work than it saves</w:t>
+            </w:r>
+          </w:p>
+        </w:tc>
+        <w:tc>
+          <w:tcPr>
+            <w:tcW w:w="1375" w:type="dxa"/>
             <w:tcBorders>
               <w:top w:val="single" w:sz="6" w:space="0" w:color="D9D9E0"/>
               <w:left w:val="single" w:sz="6" w:space="0" w:color="D9D9E0"/>
@@ -10129,11 +11207,20 @@
             <w:pPr>
               <w:spacing w:before="50" w:after="50"/>
             </w:pPr>
-          </w:p>
-        </w:tc>
-        <w:tc>
-          <w:tcPr>
-            <w:tcW w:w="1008" w:type="dxa"/>
+            <w:r>
+              <w:t>Medium;</w:t>
+            </w:r>
+            <w:r>
+              <w:t xml:space="preserve"> </w:t>
+            </w:r>
+            <w:r>
+              <w:t>the canned response library failed this way. </w:t>
+            </w:r>
+          </w:p>
+        </w:tc>
+        <w:tc>
+          <w:tcPr>
+            <w:tcW w:w="1701" w:type="dxa"/>
             <w:tcBorders>
               <w:top w:val="single" w:sz="6" w:space="0" w:color="D9D9E0"/>
               <w:left w:val="single" w:sz="6" w:space="0" w:color="D9D9E0"/>
@@ -10145,12 +11232,16 @@
           <w:p>
             <w:pPr>
               <w:spacing w:before="50" w:after="50"/>
-            </w:pPr>
-          </w:p>
-        </w:tc>
-        <w:tc>
-          <w:tcPr>
-            <w:tcW w:w="1728" w:type="dxa"/>
+              <w:jc w:val="center"/>
+            </w:pPr>
+            <w:r>
+              <w:t>High; agents stop using it.</w:t>
+            </w:r>
+          </w:p>
+        </w:tc>
+        <w:tc>
+          <w:tcPr>
+            <w:tcW w:w="1701" w:type="dxa"/>
             <w:tcBorders>
               <w:top w:val="single" w:sz="6" w:space="0" w:color="D9D9E0"/>
               <w:left w:val="single" w:sz="6" w:space="0" w:color="D9D9E0"/>
@@ -10162,12 +11253,16 @@
           <w:p>
             <w:pPr>
               <w:spacing w:before="50" w:after="50"/>
-            </w:pPr>
-          </w:p>
-        </w:tc>
-        <w:tc>
-          <w:tcPr>
-            <w:tcW w:w="3024" w:type="dxa"/>
+              <w:jc w:val="center"/>
+            </w:pPr>
+            <w:r>
+              <w:t>tier one.</w:t>
+            </w:r>
+          </w:p>
+        </w:tc>
+        <w:tc>
+          <w:tcPr>
+            <w:tcW w:w="2135" w:type="dxa"/>
             <w:tcBorders>
               <w:top w:val="single" w:sz="6" w:space="0" w:color="D9D9E0"/>
               <w:left w:val="single" w:sz="6" w:space="0" w:color="D9D9E0"/>
@@ -10180,6 +11275,139 @@
             <w:pPr>
               <w:spacing w:before="50" w:after="50"/>
             </w:pPr>
+            <w:r>
+              <w:t> keep Sofia's requested format, draft plus page; measure agent time per ticket before and after.</w:t>
+            </w:r>
+          </w:p>
+        </w:tc>
+      </w:tr>
+      <w:tr>
+        <w:trPr>
+          <w:jc w:val="center"/>
+        </w:trPr>
+        <w:tc>
+          <w:tcPr>
+            <w:tcW w:w="2736" w:type="dxa"/>
+            <w:tcBorders>
+              <w:top w:val="single" w:sz="6" w:space="0" w:color="D9D9E0"/>
+              <w:left w:val="single" w:sz="6" w:space="0" w:color="D9D9E0"/>
+              <w:bottom w:val="single" w:sz="6" w:space="0" w:color="D9D9E0"/>
+              <w:right w:val="single" w:sz="6" w:space="0" w:color="D9D9E0"/>
+            </w:tcBorders>
+            <w:shd w:val="clear" w:color="auto" w:fill="F4F4F7"/>
+          </w:tcPr>
+          <w:p>
+            <w:pPr>
+              <w:spacing w:before="50" w:after="50"/>
+              <w:jc w:val="center"/>
+              <w:rPr>
+                <w:b/>
+                <w:bCs/>
+              </w:rPr>
+            </w:pPr>
+            <w:r>
+              <w:rPr>
+                <w:b/>
+                <w:bCs/>
+              </w:rPr>
+              <w:t>Customer text is treated as an instruction</w:t>
+            </w:r>
+          </w:p>
+        </w:tc>
+        <w:tc>
+          <w:tcPr>
+            <w:tcW w:w="1375" w:type="dxa"/>
+            <w:tcBorders>
+              <w:top w:val="single" w:sz="6" w:space="0" w:color="D9D9E0"/>
+              <w:left w:val="single" w:sz="6" w:space="0" w:color="D9D9E0"/>
+              <w:bottom w:val="single" w:sz="6" w:space="0" w:color="D9D9E0"/>
+              <w:right w:val="single" w:sz="6" w:space="0" w:color="D9D9E0"/>
+            </w:tcBorders>
+            <w:shd w:val="clear" w:color="auto" w:fill="F4F4F7"/>
+          </w:tcPr>
+          <w:p>
+            <w:pPr>
+              <w:spacing w:before="50" w:after="50"/>
+            </w:pPr>
+            <w:r>
+              <w:t>Medium;</w:t>
+            </w:r>
+            <w:r>
+              <w:t xml:space="preserve"> </w:t>
+            </w:r>
+            <w:r>
+              <w:t>every input is free text from strangers. </w:t>
+            </w:r>
+          </w:p>
+        </w:tc>
+        <w:tc>
+          <w:tcPr>
+            <w:tcW w:w="1701" w:type="dxa"/>
+            <w:tcBorders>
+              <w:top w:val="single" w:sz="6" w:space="0" w:color="D9D9E0"/>
+              <w:left w:val="single" w:sz="6" w:space="0" w:color="D9D9E0"/>
+              <w:bottom w:val="single" w:sz="6" w:space="0" w:color="D9D9E0"/>
+              <w:right w:val="single" w:sz="6" w:space="0" w:color="D9D9E0"/>
+            </w:tcBorders>
+            <w:shd w:val="clear" w:color="auto" w:fill="F4F4F7"/>
+          </w:tcPr>
+          <w:p>
+            <w:pPr>
+              <w:spacing w:before="50" w:after="50"/>
+              <w:jc w:val="center"/>
+            </w:pPr>
+            <w:r>
+              <w:t xml:space="preserve">High; </w:t>
+            </w:r>
+            <w:r>
+              <w:t>the system can be redirected.</w:t>
+            </w:r>
+          </w:p>
+        </w:tc>
+        <w:tc>
+          <w:tcPr>
+            <w:tcW w:w="1701" w:type="dxa"/>
+            <w:tcBorders>
+              <w:top w:val="single" w:sz="6" w:space="0" w:color="D9D9E0"/>
+              <w:left w:val="single" w:sz="6" w:space="0" w:color="D9D9E0"/>
+              <w:bottom w:val="single" w:sz="6" w:space="0" w:color="D9D9E0"/>
+              <w:right w:val="single" w:sz="6" w:space="0" w:color="D9D9E0"/>
+            </w:tcBorders>
+            <w:shd w:val="clear" w:color="auto" w:fill="F4F4F7"/>
+          </w:tcPr>
+          <w:p>
+            <w:pPr>
+              <w:spacing w:before="50" w:after="50"/>
+              <w:jc w:val="center"/>
+            </w:pPr>
+            <w:proofErr w:type="spellStart"/>
+            <w:r>
+              <w:t>CloudServe</w:t>
+            </w:r>
+            <w:proofErr w:type="spellEnd"/>
+          </w:p>
+        </w:tc>
+        <w:tc>
+          <w:tcPr>
+            <w:tcW w:w="2135" w:type="dxa"/>
+            <w:tcBorders>
+              <w:top w:val="single" w:sz="6" w:space="0" w:color="D9D9E0"/>
+              <w:left w:val="single" w:sz="6" w:space="0" w:color="D9D9E0"/>
+              <w:bottom w:val="single" w:sz="6" w:space="0" w:color="D9D9E0"/>
+              <w:right w:val="single" w:sz="6" w:space="0" w:color="D9D9E0"/>
+            </w:tcBorders>
+            <w:shd w:val="clear" w:color="auto" w:fill="F4F4F7"/>
+          </w:tcPr>
+          <w:p>
+            <w:pPr>
+              <w:spacing w:before="50" w:after="50"/>
+            </w:pPr>
+            <w:r>
+              <w:t> </w:t>
+            </w:r>
+            <w:r>
+              <w:t>separate ticket content from system instructions; detect and block, log the input for review.</w:t>
+            </w:r>
           </w:p>
         </w:tc>
       </w:tr>
@@ -10356,6 +11584,25 @@
             <w:pPr>
               <w:spacing w:before="50" w:after="50"/>
             </w:pPr>
+            <w:r>
+              <w:t xml:space="preserve">1) A chatbot. </w:t>
+            </w:r>
+          </w:p>
+          <w:p>
+            <w:pPr>
+              <w:spacing w:before="50" w:after="50"/>
+            </w:pPr>
+            <w:r>
+              <w:t xml:space="preserve">2) Marcus pictures it "answering the easy ones so my people can do the hard ones". </w:t>
+            </w:r>
+          </w:p>
+          <w:p>
+            <w:pPr>
+              <w:spacing w:before="50" w:after="50"/>
+            </w:pPr>
+            <w:r>
+              <w:t>3) He has "no strong view about how it works". 4) The number he needs down is response time, without extra headcount.</w:t>
+            </w:r>
           </w:p>
         </w:tc>
         <w:tc>
@@ -10372,6 +11619,23 @@
             <w:pPr>
               <w:spacing w:before="50" w:after="50"/>
             </w:pPr>
+            <w:r>
+              <w:t xml:space="preserve">Section 1, </w:t>
+            </w:r>
+            <w:proofErr w:type="gramStart"/>
+            <w:r>
+              <w:t xml:space="preserve">Marcus </w:t>
+            </w:r>
+            <w:r>
+              <w:t>,</w:t>
+            </w:r>
+            <w:proofErr w:type="gramEnd"/>
+            <w:r>
+              <w:t xml:space="preserve"> </w:t>
+            </w:r>
+            <w:r>
+              <w:t>Section 4, row 1.</w:t>
+            </w:r>
           </w:p>
         </w:tc>
       </w:tr>
@@ -10417,6 +11681,49 @@
             <w:pPr>
               <w:spacing w:before="50" w:after="50"/>
             </w:pPr>
+            <w:r>
+              <w:t xml:space="preserve">1) 71.4% of tickets already have an answer in the 29 articles. </w:t>
+            </w:r>
+          </w:p>
+          <w:p>
+            <w:pPr>
+              <w:spacing w:before="50" w:after="50"/>
+            </w:pPr>
+            <w:r>
+              <w:t xml:space="preserve">2) 138 of those still went to tier two. </w:t>
+            </w:r>
+          </w:p>
+          <w:p>
+            <w:pPr>
+              <w:spacing w:before="50" w:after="50"/>
+            </w:pPr>
+            <w:r>
+              <w:t xml:space="preserve">3) Agents cannot find the articles because search is keyword-on-title, so they answer from memory and private files. </w:t>
+            </w:r>
+          </w:p>
+          <w:p>
+            <w:pPr>
+              <w:spacing w:before="50" w:after="50"/>
+            </w:pPr>
+            <w:r>
+              <w:t xml:space="preserve">4) Half of escalations (49.1%) were resolvable at tier one. </w:t>
+            </w:r>
+          </w:p>
+          <w:p>
+            <w:pPr>
+              <w:spacing w:before="50" w:after="50"/>
+            </w:pPr>
+            <w:r>
+              <w:t xml:space="preserve">5) Escalations arrive with no context, so tier two re-reads and re-asks. </w:t>
+            </w:r>
+          </w:p>
+          <w:p>
+            <w:pPr>
+              <w:spacing w:before="50" w:after="50"/>
+            </w:pPr>
+            <w:r>
+              <w:t>6) Agents want a draft with the source page attached, not a replacement.</w:t>
+            </w:r>
           </w:p>
         </w:tc>
         <w:tc>
@@ -10434,6 +11741,41 @@
             <w:pPr>
               <w:spacing w:before="50" w:after="50"/>
             </w:pPr>
+            <w:r>
+              <w:t xml:space="preserve">Section 2, row 8; Section 1, disagreements rows 1 and 3; </w:t>
+            </w:r>
+          </w:p>
+          <w:p>
+            <w:pPr>
+              <w:spacing w:before="50" w:after="50"/>
+            </w:pPr>
+            <w:r>
+              <w:t xml:space="preserve">Section 1, Sofia row </w:t>
+            </w:r>
+            <w:proofErr w:type="gramStart"/>
+            <w:r>
+              <w:t>point</w:t>
+            </w:r>
+            <w:proofErr w:type="gramEnd"/>
+            <w:r>
+              <w:t xml:space="preserve"> 5, Ines row </w:t>
+            </w:r>
+            <w:proofErr w:type="gramStart"/>
+            <w:r>
+              <w:t>point</w:t>
+            </w:r>
+            <w:proofErr w:type="gramEnd"/>
+            <w:r>
+              <w:t xml:space="preserve"> 3, Daniel row points 3 to 5; </w:t>
+            </w:r>
+          </w:p>
+          <w:p>
+            <w:pPr>
+              <w:spacing w:before="50" w:after="50"/>
+            </w:pPr>
+            <w:r>
+              <w:t>Section 3, steps 4, 5 and 7.</w:t>
+            </w:r>
           </w:p>
         </w:tc>
       </w:tr>
@@ -10477,6 +11819,33 @@
             <w:pPr>
               <w:spacing w:before="50" w:after="50"/>
             </w:pPr>
+            <w:r>
+              <w:t xml:space="preserve">1) A chatbot delivers answers; it does not decide where answers come from, when to stay silent, or who is accountable. </w:t>
+            </w:r>
+          </w:p>
+          <w:p>
+            <w:pPr>
+              <w:spacing w:before="50" w:after="50"/>
+            </w:pPr>
+            <w:r>
+              <w:t xml:space="preserve">2) The client's first failure condition is a wrong answer sent, so the system must be able to say nothing and escalate. </w:t>
+            </w:r>
+          </w:p>
+          <w:p>
+            <w:pPr>
+              <w:spacing w:before="50" w:after="50"/>
+            </w:pPr>
+            <w:r>
+              <w:t xml:space="preserve">3) 17.4% of tickets must never be automated at all. </w:t>
+            </w:r>
+          </w:p>
+          <w:p>
+            <w:pPr>
+              <w:spacing w:before="50" w:after="50"/>
+            </w:pPr>
+            <w:r>
+              <w:t>4) The value is as much in better escalations as in automatic answers.</w:t>
+            </w:r>
           </w:p>
         </w:tc>
         <w:tc>
@@ -10493,6 +11862,37 @@
             <w:pPr>
               <w:spacing w:before="50" w:after="50"/>
             </w:pPr>
+          </w:p>
+          <w:p>
+            <w:r>
+              <w:t xml:space="preserve">Section 1, </w:t>
+            </w:r>
+            <w:proofErr w:type="gramStart"/>
+            <w:r>
+              <w:t>Marcus</w:t>
+            </w:r>
+            <w:proofErr w:type="gramEnd"/>
+            <w:r>
+              <w:t xml:space="preserve"> row (failure conditions);</w:t>
+            </w:r>
+          </w:p>
+          <w:p>
+            <w:r>
+              <w:t xml:space="preserve"> Section 4, row 7; </w:t>
+            </w:r>
+          </w:p>
+          <w:p>
+            <w:r>
+              <w:t xml:space="preserve">Section 2, row 12; Section 1, Daniel row </w:t>
+            </w:r>
+            <w:proofErr w:type="gramStart"/>
+            <w:r>
+              <w:t>point</w:t>
+            </w:r>
+            <w:proofErr w:type="gramEnd"/>
+            <w:r>
+              <w:t xml:space="preserve"> 5; Section 5, risks 1 and 5.</w:t>
+            </w:r>
           </w:p>
         </w:tc>
       </w:tr>
@@ -10538,6 +11938,53 @@
             <w:pPr>
               <w:spacing w:before="50" w:after="50"/>
             </w:pPr>
+            <w:r>
+              <w:t xml:space="preserve">1) Customers: median 214 min to resolution, p95 21 hours, only 45% inside the 2-hour SLA; the cost of waiting depends on urgency, but </w:t>
+            </w:r>
+            <w:r>
+              <w:lastRenderedPageBreak/>
+              <w:t xml:space="preserve">urgent tickets are slowest. </w:t>
+            </w:r>
+          </w:p>
+          <w:p>
+            <w:pPr>
+              <w:spacing w:before="50" w:after="50"/>
+            </w:pPr>
+            <w:r>
+              <w:t xml:space="preserve">2) Escalated customers: CSAT 2.63 vs 3.41, and 38.4% come back. </w:t>
+            </w:r>
+          </w:p>
+          <w:p>
+            <w:pPr>
+              <w:spacing w:before="50" w:after="50"/>
+            </w:pPr>
+            <w:r>
+              <w:t xml:space="preserve">3) Tier one: time lost finding and writing known answers. </w:t>
+            </w:r>
+          </w:p>
+          <w:p>
+            <w:pPr>
+              <w:spacing w:before="50" w:after="50"/>
+            </w:pPr>
+            <w:r>
+              <w:t xml:space="preserve">4) Tier two: half their queue is not tier-two work. </w:t>
+            </w:r>
+          </w:p>
+          <w:p>
+            <w:pPr>
+              <w:spacing w:before="50" w:after="50"/>
+            </w:pPr>
+            <w:r>
+              <w:t xml:space="preserve">5) Enterprise: slowest tier despite the stricter agreement. </w:t>
+            </w:r>
+          </w:p>
+          <w:p>
+            <w:pPr>
+              <w:spacing w:before="50" w:after="50"/>
+            </w:pPr>
+            <w:r>
+              <w:t>6) The team: two agents left citing workload.</w:t>
+            </w:r>
           </w:p>
         </w:tc>
         <w:tc>
@@ -10555,6 +12002,38 @@
             <w:pPr>
               <w:spacing w:before="50" w:after="50"/>
             </w:pPr>
+            <w:r>
+              <w:lastRenderedPageBreak/>
+              <w:t xml:space="preserve"> Section 2, rows 4, 5, 10, 11, 13; </w:t>
+            </w:r>
+          </w:p>
+          <w:p>
+            <w:pPr>
+              <w:spacing w:before="50" w:after="50"/>
+            </w:pPr>
+            <w:r>
+              <w:t xml:space="preserve">Section 1, Ravi row points 1 </w:t>
+            </w:r>
+            <w:r>
+              <w:lastRenderedPageBreak/>
+              <w:t xml:space="preserve">and 2; </w:t>
+            </w:r>
+          </w:p>
+          <w:p>
+            <w:pPr>
+              <w:spacing w:before="50" w:after="50"/>
+            </w:pPr>
+            <w:r>
+              <w:t xml:space="preserve">Section 3, steps 4 to 7; Section 1, disagreements row 4; </w:t>
+            </w:r>
+          </w:p>
+          <w:p>
+            <w:pPr>
+              <w:spacing w:before="50" w:after="50"/>
+            </w:pPr>
+            <w:r>
+              <w:t>Section 4, extra row on attrition.</w:t>
+            </w:r>
           </w:p>
         </w:tc>
       </w:tr>
@@ -10598,6 +12077,49 @@
             <w:pPr>
               <w:spacing w:before="50" w:after="50"/>
             </w:pPr>
+            <w:r>
+              <w:t xml:space="preserve">1) FCR from 42 to 44% toward 60 to 65%. </w:t>
+            </w:r>
+          </w:p>
+          <w:p>
+            <w:pPr>
+              <w:spacing w:before="50" w:after="50"/>
+            </w:pPr>
+            <w:r>
+              <w:t xml:space="preserve">2) Escalation from 56 to 58% toward 30%. </w:t>
+            </w:r>
+          </w:p>
+          <w:p>
+            <w:pPr>
+              <w:spacing w:before="50" w:after="50"/>
+            </w:pPr>
+            <w:r>
+              <w:t xml:space="preserve">3) Repeat contacts halved from 21.6%. </w:t>
+            </w:r>
+          </w:p>
+          <w:p>
+            <w:pPr>
+              <w:spacing w:before="50" w:after="50"/>
+            </w:pPr>
+            <w:r>
+              <w:t xml:space="preserve">4) Agents freed for the 28.7% of effort that can never be automated. </w:t>
+            </w:r>
+          </w:p>
+          <w:p>
+            <w:pPr>
+              <w:spacing w:before="50" w:after="50"/>
+            </w:pPr>
+            <w:r>
+              <w:t xml:space="preserve">5) Tier two "twice as fast" when escalations carry context. </w:t>
+            </w:r>
+          </w:p>
+          <w:p>
+            <w:pPr>
+              <w:spacing w:before="50" w:after="50"/>
+            </w:pPr>
+            <w:r>
+              <w:t>6) Every decision explainable for the compliance review.</w:t>
+            </w:r>
           </w:p>
         </w:tc>
         <w:tc>
@@ -10614,6 +12136,41 @@
             <w:pPr>
               <w:spacing w:before="50" w:after="50"/>
             </w:pPr>
+            <w:r>
+              <w:t xml:space="preserve">Section 4, rows 2, 3, 6; Section 3, row 6; </w:t>
+            </w:r>
+          </w:p>
+          <w:p>
+            <w:pPr>
+              <w:spacing w:before="50" w:after="50"/>
+            </w:pPr>
+            <w:r>
+              <w:t xml:space="preserve">Section 1, Daniel row </w:t>
+            </w:r>
+            <w:proofErr w:type="gramStart"/>
+            <w:r>
+              <w:t>point</w:t>
+            </w:r>
+            <w:proofErr w:type="gramEnd"/>
+            <w:r>
+              <w:t xml:space="preserve"> 5; </w:t>
+            </w:r>
+          </w:p>
+          <w:p>
+            <w:pPr>
+              <w:spacing w:before="50" w:after="50"/>
+            </w:pPr>
+            <w:r>
+              <w:t xml:space="preserve">Section 1, </w:t>
+            </w:r>
+            <w:proofErr w:type="gramStart"/>
+            <w:r>
+              <w:t>Marcus</w:t>
+            </w:r>
+            <w:proofErr w:type="gramEnd"/>
+            <w:r>
+              <w:t xml:space="preserve"> row (compliance).</w:t>
+            </w:r>
           </w:p>
         </w:tc>
       </w:tr>
@@ -10659,6 +12216,41 @@
             <w:pPr>
               <w:spacing w:before="50" w:after="50"/>
             </w:pPr>
+            <w:r>
+              <w:t xml:space="preserve">1) Automatic answers for compliance, security, feature and unclear requests (87 tickets). </w:t>
+            </w:r>
+          </w:p>
+          <w:p>
+            <w:pPr>
+              <w:spacing w:before="50" w:after="50"/>
+            </w:pPr>
+            <w:r>
+              <w:t xml:space="preserve">2) Any commitment about refunds, fixes, or delivery dates. </w:t>
+            </w:r>
+          </w:p>
+          <w:p>
+            <w:pPr>
+              <w:spacing w:before="50" w:after="50"/>
+            </w:pPr>
+            <w:r>
+              <w:t xml:space="preserve">3) Learning from agents' private snippet files. </w:t>
+            </w:r>
+          </w:p>
+          <w:p>
+            <w:pPr>
+              <w:spacing w:before="50" w:after="50"/>
+            </w:pPr>
+            <w:r>
+              <w:t>4) Writing new documentation; that stays with Ines.</w:t>
+            </w:r>
+          </w:p>
+          <w:p>
+            <w:pPr>
+              <w:spacing w:before="50" w:after="50"/>
+            </w:pPr>
+            <w:r>
+              <w:t xml:space="preserve"> 5) Measuring time to first reply directly, since no such field exists; resolution time is the stated proxy.</w:t>
+            </w:r>
           </w:p>
         </w:tc>
         <w:tc>
@@ -10676,6 +12268,41 @@
             <w:pPr>
               <w:spacing w:before="50" w:after="50"/>
             </w:pPr>
+            <w:r>
+              <w:t xml:space="preserve">Section 2, row 12; </w:t>
+            </w:r>
+          </w:p>
+          <w:p>
+            <w:pPr>
+              <w:spacing w:before="50" w:after="50"/>
+            </w:pPr>
+            <w:r>
+              <w:t xml:space="preserve">Section 5, risk 6 and data source 3; </w:t>
+            </w:r>
+          </w:p>
+          <w:p>
+            <w:pPr>
+              <w:spacing w:before="50" w:after="50"/>
+            </w:pPr>
+            <w:r>
+              <w:t xml:space="preserve">Section 1, Ines row points 4 and 5; </w:t>
+            </w:r>
+          </w:p>
+          <w:p>
+            <w:pPr>
+              <w:spacing w:before="50" w:after="50"/>
+            </w:pPr>
+            <w:r>
+              <w:t xml:space="preserve">Section 1, nobody-said row 4; </w:t>
+            </w:r>
+          </w:p>
+          <w:p>
+            <w:pPr>
+              <w:spacing w:before="50" w:after="50"/>
+            </w:pPr>
+            <w:r>
+              <w:t>Section 2, row 13.</w:t>
+            </w:r>
           </w:p>
         </w:tc>
       </w:tr>
@@ -10769,6 +12396,18 @@
             <w:pPr>
               <w:spacing w:before="50" w:after="50"/>
             </w:pPr>
+            <w:proofErr w:type="spellStart"/>
+            <w:r>
+              <w:t>CloudServe</w:t>
+            </w:r>
+            <w:proofErr w:type="spellEnd"/>
+            <w:r>
+              <w:t xml:space="preserve"> asked for a chatbot to answer the easy tickets so the team can handle the hard ones. The evidence </w:t>
+            </w:r>
+            <w:r>
+              <w:lastRenderedPageBreak/>
+              <w:t>says the team is not short of answers; it is short of a way to reach them. Seven in ten tickets already have their answer written in the twenty-nine support articles, yet more than a third of those tickets are still handed to tier two, because agents cannot find the right article quickly and fall back on memory and private notes. Nearly half of what reaches tier two could have been closed at tier one, and it arrives with no summary, so the engineer re-reads the thread and asks the customer questions they have already answered. That double handling, not just the wait, is what customers mark down: tickets passed on score 2.6 out of 5 against 3.4 for those closed first time, and almost four in ten of them come back a second time. Enterprise customers, who hold the stricter agreement, are currently served slowest. The problem is that known answers are not reaching agents or customers at the first touch, and that every hand-over loses the context the next person needs. Any fix must say nothing rather than say something wrong, must always pass security, compliance, feature and unclear requests to a person, and must be able to explain every decision it makes.</w:t>
+            </w:r>
           </w:p>
         </w:tc>
       </w:tr>
@@ -12791,6 +14430,155 @@
     </w:lvl>
   </w:abstractNum>
   <w:abstractNum w:abstractNumId="24" w15:restartNumberingAfterBreak="0">
+    <w:nsid w:val="3D181187"/>
+    <w:multiLevelType w:val="multilevel"/>
+    <w:tmpl w:val="5126ABE2"/>
+    <w:lvl w:ilvl="0">
+      <w:start w:val="1"/>
+      <w:numFmt w:val="bullet"/>
+      <w:lvlText w:val=""/>
+      <w:lvlJc w:val="left"/>
+      <w:pPr>
+        <w:tabs>
+          <w:tab w:val="num" w:pos="720"/>
+        </w:tabs>
+        <w:ind w:left="720" w:hanging="360"/>
+      </w:pPr>
+      <w:rPr>
+        <w:rFonts w:ascii="Symbol" w:hAnsi="Symbol" w:hint="default"/>
+        <w:sz w:val="20"/>
+      </w:rPr>
+    </w:lvl>
+    <w:lvl w:ilvl="1" w:tentative="1">
+      <w:start w:val="1"/>
+      <w:numFmt w:val="bullet"/>
+      <w:lvlText w:val="o"/>
+      <w:lvlJc w:val="left"/>
+      <w:pPr>
+        <w:tabs>
+          <w:tab w:val="num" w:pos="1440"/>
+        </w:tabs>
+        <w:ind w:left="1440" w:hanging="360"/>
+      </w:pPr>
+      <w:rPr>
+        <w:rFonts w:ascii="Courier New" w:hAnsi="Courier New" w:hint="default"/>
+        <w:sz w:val="20"/>
+      </w:rPr>
+    </w:lvl>
+    <w:lvl w:ilvl="2" w:tentative="1">
+      <w:start w:val="1"/>
+      <w:numFmt w:val="bullet"/>
+      <w:lvlText w:val=""/>
+      <w:lvlJc w:val="left"/>
+      <w:pPr>
+        <w:tabs>
+          <w:tab w:val="num" w:pos="2160"/>
+        </w:tabs>
+        <w:ind w:left="2160" w:hanging="360"/>
+      </w:pPr>
+      <w:rPr>
+        <w:rFonts w:ascii="Wingdings" w:hAnsi="Wingdings" w:hint="default"/>
+        <w:sz w:val="20"/>
+      </w:rPr>
+    </w:lvl>
+    <w:lvl w:ilvl="3" w:tentative="1">
+      <w:start w:val="1"/>
+      <w:numFmt w:val="bullet"/>
+      <w:lvlText w:val=""/>
+      <w:lvlJc w:val="left"/>
+      <w:pPr>
+        <w:tabs>
+          <w:tab w:val="num" w:pos="2880"/>
+        </w:tabs>
+        <w:ind w:left="2880" w:hanging="360"/>
+      </w:pPr>
+      <w:rPr>
+        <w:rFonts w:ascii="Wingdings" w:hAnsi="Wingdings" w:hint="default"/>
+        <w:sz w:val="20"/>
+      </w:rPr>
+    </w:lvl>
+    <w:lvl w:ilvl="4" w:tentative="1">
+      <w:start w:val="1"/>
+      <w:numFmt w:val="bullet"/>
+      <w:lvlText w:val=""/>
+      <w:lvlJc w:val="left"/>
+      <w:pPr>
+        <w:tabs>
+          <w:tab w:val="num" w:pos="3600"/>
+        </w:tabs>
+        <w:ind w:left="3600" w:hanging="360"/>
+      </w:pPr>
+      <w:rPr>
+        <w:rFonts w:ascii="Wingdings" w:hAnsi="Wingdings" w:hint="default"/>
+        <w:sz w:val="20"/>
+      </w:rPr>
+    </w:lvl>
+    <w:lvl w:ilvl="5" w:tentative="1">
+      <w:start w:val="1"/>
+      <w:numFmt w:val="bullet"/>
+      <w:lvlText w:val=""/>
+      <w:lvlJc w:val="left"/>
+      <w:pPr>
+        <w:tabs>
+          <w:tab w:val="num" w:pos="4320"/>
+        </w:tabs>
+        <w:ind w:left="4320" w:hanging="360"/>
+      </w:pPr>
+      <w:rPr>
+        <w:rFonts w:ascii="Wingdings" w:hAnsi="Wingdings" w:hint="default"/>
+        <w:sz w:val="20"/>
+      </w:rPr>
+    </w:lvl>
+    <w:lvl w:ilvl="6" w:tentative="1">
+      <w:start w:val="1"/>
+      <w:numFmt w:val="bullet"/>
+      <w:lvlText w:val=""/>
+      <w:lvlJc w:val="left"/>
+      <w:pPr>
+        <w:tabs>
+          <w:tab w:val="num" w:pos="5040"/>
+        </w:tabs>
+        <w:ind w:left="5040" w:hanging="360"/>
+      </w:pPr>
+      <w:rPr>
+        <w:rFonts w:ascii="Wingdings" w:hAnsi="Wingdings" w:hint="default"/>
+        <w:sz w:val="20"/>
+      </w:rPr>
+    </w:lvl>
+    <w:lvl w:ilvl="7" w:tentative="1">
+      <w:start w:val="1"/>
+      <w:numFmt w:val="bullet"/>
+      <w:lvlText w:val=""/>
+      <w:lvlJc w:val="left"/>
+      <w:pPr>
+        <w:tabs>
+          <w:tab w:val="num" w:pos="5760"/>
+        </w:tabs>
+        <w:ind w:left="5760" w:hanging="360"/>
+      </w:pPr>
+      <w:rPr>
+        <w:rFonts w:ascii="Wingdings" w:hAnsi="Wingdings" w:hint="default"/>
+        <w:sz w:val="20"/>
+      </w:rPr>
+    </w:lvl>
+    <w:lvl w:ilvl="8" w:tentative="1">
+      <w:start w:val="1"/>
+      <w:numFmt w:val="bullet"/>
+      <w:lvlText w:val=""/>
+      <w:lvlJc w:val="left"/>
+      <w:pPr>
+        <w:tabs>
+          <w:tab w:val="num" w:pos="6480"/>
+        </w:tabs>
+        <w:ind w:left="6480" w:hanging="360"/>
+      </w:pPr>
+      <w:rPr>
+        <w:rFonts w:ascii="Wingdings" w:hAnsi="Wingdings" w:hint="default"/>
+        <w:sz w:val="20"/>
+      </w:rPr>
+    </w:lvl>
+  </w:abstractNum>
+  <w:abstractNum w:abstractNumId="25" w15:restartNumberingAfterBreak="0">
     <w:nsid w:val="3F2F27F9"/>
     <w:multiLevelType w:val="hybridMultilevel"/>
     <w:tmpl w:val="C486CC0C"/>
@@ -12879,7 +14667,7 @@
       </w:pPr>
     </w:lvl>
   </w:abstractNum>
-  <w:abstractNum w:abstractNumId="25" w15:restartNumberingAfterBreak="0">
+  <w:abstractNum w:abstractNumId="26" w15:restartNumberingAfterBreak="0">
     <w:nsid w:val="41D4161D"/>
     <w:multiLevelType w:val="hybridMultilevel"/>
     <w:tmpl w:val="1EEE0220"/>
@@ -12992,7 +14780,7 @@
       </w:rPr>
     </w:lvl>
   </w:abstractNum>
-  <w:abstractNum w:abstractNumId="26" w15:restartNumberingAfterBreak="0">
+  <w:abstractNum w:abstractNumId="27" w15:restartNumberingAfterBreak="0">
     <w:nsid w:val="46DA4D1D"/>
     <w:multiLevelType w:val="hybridMultilevel"/>
     <w:tmpl w:val="5C22E496"/>
@@ -13081,7 +14869,7 @@
       </w:pPr>
     </w:lvl>
   </w:abstractNum>
-  <w:abstractNum w:abstractNumId="27" w15:restartNumberingAfterBreak="0">
+  <w:abstractNum w:abstractNumId="28" w15:restartNumberingAfterBreak="0">
     <w:nsid w:val="4A310DC0"/>
     <w:multiLevelType w:val="hybridMultilevel"/>
     <w:tmpl w:val="5122FAB2"/>
@@ -13170,7 +14958,7 @@
       </w:pPr>
     </w:lvl>
   </w:abstractNum>
-  <w:abstractNum w:abstractNumId="28" w15:restartNumberingAfterBreak="0">
+  <w:abstractNum w:abstractNumId="29" w15:restartNumberingAfterBreak="0">
     <w:nsid w:val="4C9405CC"/>
     <w:multiLevelType w:val="hybridMultilevel"/>
     <w:tmpl w:val="17FC6114"/>
@@ -13283,7 +15071,7 @@
       </w:rPr>
     </w:lvl>
   </w:abstractNum>
-  <w:abstractNum w:abstractNumId="29" w15:restartNumberingAfterBreak="0">
+  <w:abstractNum w:abstractNumId="30" w15:restartNumberingAfterBreak="0">
     <w:nsid w:val="52344C71"/>
     <w:multiLevelType w:val="hybridMultilevel"/>
     <w:tmpl w:val="B9DA53A6"/>
@@ -13372,7 +15160,7 @@
       </w:pPr>
     </w:lvl>
   </w:abstractNum>
-  <w:abstractNum w:abstractNumId="30" w15:restartNumberingAfterBreak="0">
+  <w:abstractNum w:abstractNumId="31" w15:restartNumberingAfterBreak="0">
     <w:nsid w:val="52D34128"/>
     <w:multiLevelType w:val="multilevel"/>
     <w:tmpl w:val="A92EF522"/>
@@ -13485,7 +15273,7 @@
       </w:pPr>
     </w:lvl>
   </w:abstractNum>
-  <w:abstractNum w:abstractNumId="31" w15:restartNumberingAfterBreak="0">
+  <w:abstractNum w:abstractNumId="32" w15:restartNumberingAfterBreak="0">
     <w:nsid w:val="531F12B5"/>
     <w:multiLevelType w:val="hybridMultilevel"/>
     <w:tmpl w:val="7E6431A4"/>
@@ -13574,7 +15362,7 @@
       </w:pPr>
     </w:lvl>
   </w:abstractNum>
-  <w:abstractNum w:abstractNumId="32" w15:restartNumberingAfterBreak="0">
+  <w:abstractNum w:abstractNumId="33" w15:restartNumberingAfterBreak="0">
     <w:nsid w:val="55057566"/>
     <w:multiLevelType w:val="multilevel"/>
     <w:tmpl w:val="A3B01398"/>
@@ -13687,7 +15475,7 @@
       </w:pPr>
     </w:lvl>
   </w:abstractNum>
-  <w:abstractNum w:abstractNumId="33" w15:restartNumberingAfterBreak="0">
+  <w:abstractNum w:abstractNumId="34" w15:restartNumberingAfterBreak="0">
     <w:nsid w:val="591C4D84"/>
     <w:multiLevelType w:val="multilevel"/>
     <w:tmpl w:val="1B444CBC"/>
@@ -13800,7 +15588,7 @@
       </w:pPr>
     </w:lvl>
   </w:abstractNum>
-  <w:abstractNum w:abstractNumId="34" w15:restartNumberingAfterBreak="0">
+  <w:abstractNum w:abstractNumId="35" w15:restartNumberingAfterBreak="0">
     <w:nsid w:val="5F9C272D"/>
     <w:multiLevelType w:val="hybridMultilevel"/>
     <w:tmpl w:val="D174F40E"/>
@@ -13889,7 +15677,7 @@
       </w:pPr>
     </w:lvl>
   </w:abstractNum>
-  <w:abstractNum w:abstractNumId="35" w15:restartNumberingAfterBreak="0">
+  <w:abstractNum w:abstractNumId="36" w15:restartNumberingAfterBreak="0">
     <w:nsid w:val="723518BA"/>
     <w:multiLevelType w:val="multilevel"/>
     <w:tmpl w:val="75C69E22"/>
@@ -14002,7 +15790,7 @@
       </w:pPr>
     </w:lvl>
   </w:abstractNum>
-  <w:abstractNum w:abstractNumId="36" w15:restartNumberingAfterBreak="0">
+  <w:abstractNum w:abstractNumId="37" w15:restartNumberingAfterBreak="0">
     <w:nsid w:val="77670DD0"/>
     <w:multiLevelType w:val="hybridMultilevel"/>
     <w:tmpl w:val="0ACC6DA6"/>
@@ -14116,34 +15904,34 @@
     <w:abstractNumId w:val="0"/>
   </w:num>
   <w:num w:numId="10" w16cid:durableId="1290085216">
-    <w:abstractNumId w:val="29"/>
+    <w:abstractNumId w:val="30"/>
   </w:num>
   <w:num w:numId="11" w16cid:durableId="2084832518">
-    <w:abstractNumId w:val="34"/>
+    <w:abstractNumId w:val="35"/>
   </w:num>
   <w:num w:numId="12" w16cid:durableId="1865552323">
     <w:abstractNumId w:val="22"/>
   </w:num>
   <w:num w:numId="13" w16cid:durableId="812064604">
-    <w:abstractNumId w:val="31"/>
+    <w:abstractNumId w:val="32"/>
   </w:num>
   <w:num w:numId="14" w16cid:durableId="2068915777">
     <w:abstractNumId w:val="17"/>
   </w:num>
   <w:num w:numId="15" w16cid:durableId="357585877">
-    <w:abstractNumId w:val="33"/>
+    <w:abstractNumId w:val="34"/>
   </w:num>
   <w:num w:numId="16" w16cid:durableId="1713916515">
-    <w:abstractNumId w:val="30"/>
+    <w:abstractNumId w:val="31"/>
   </w:num>
   <w:num w:numId="17" w16cid:durableId="381252428">
-    <w:abstractNumId w:val="35"/>
+    <w:abstractNumId w:val="36"/>
   </w:num>
   <w:num w:numId="18" w16cid:durableId="1754471157">
     <w:abstractNumId w:val="9"/>
   </w:num>
   <w:num w:numId="19" w16cid:durableId="1495141322">
-    <w:abstractNumId w:val="36"/>
+    <w:abstractNumId w:val="37"/>
   </w:num>
   <w:num w:numId="20" w16cid:durableId="1796410182">
     <w:abstractNumId w:val="18"/>
@@ -14155,13 +15943,13 @@
     <w:abstractNumId w:val="12"/>
   </w:num>
   <w:num w:numId="23" w16cid:durableId="267200832">
-    <w:abstractNumId w:val="32"/>
+    <w:abstractNumId w:val="33"/>
   </w:num>
   <w:num w:numId="24" w16cid:durableId="1932204017">
-    <w:abstractNumId w:val="27"/>
+    <w:abstractNumId w:val="28"/>
   </w:num>
   <w:num w:numId="25" w16cid:durableId="1018848263">
-    <w:abstractNumId w:val="26"/>
+    <w:abstractNumId w:val="27"/>
   </w:num>
   <w:num w:numId="26" w16cid:durableId="1472019840">
     <w:abstractNumId w:val="19"/>
@@ -14170,7 +15958,7 @@
     <w:abstractNumId w:val="21"/>
   </w:num>
   <w:num w:numId="28" w16cid:durableId="217514565">
-    <w:abstractNumId w:val="25"/>
+    <w:abstractNumId w:val="26"/>
   </w:num>
   <w:num w:numId="29" w16cid:durableId="1198588799">
     <w:abstractNumId w:val="20"/>
@@ -14182,10 +15970,10 @@
     <w:abstractNumId w:val="14"/>
   </w:num>
   <w:num w:numId="32" w16cid:durableId="1714960686">
-    <w:abstractNumId w:val="28"/>
+    <w:abstractNumId w:val="29"/>
   </w:num>
   <w:num w:numId="33" w16cid:durableId="542446481">
-    <w:abstractNumId w:val="24"/>
+    <w:abstractNumId w:val="25"/>
   </w:num>
   <w:num w:numId="34" w16cid:durableId="1354069690">
     <w:abstractNumId w:val="11"/>
@@ -14198,6 +15986,9 @@
   </w:num>
   <w:num w:numId="37" w16cid:durableId="1070544988">
     <w:abstractNumId w:val="16"/>
+  </w:num>
+  <w:num w:numId="38" w16cid:durableId="980499926">
+    <w:abstractNumId w:val="24"/>
   </w:num>
 </w:numbering>
 </file>

</xml_diff>

<commit_message>
B-01 environment, B-02 ingest, workbooks and prompts
</commit_message>
<xml_diff>
--- a/Docs/Capstone_Project/02_Stage_Workbooks/Stage_1_Discovery_Workbook.docx
+++ b/Docs/Capstone_Project/02_Stage_Workbooks/Stage_1_Discovery_Workbook.docx
@@ -116,25 +116,7 @@
                 <w:color w:val="FFFFFF"/>
                 <w:sz w:val="20"/>
               </w:rPr>
-              <w:t xml:space="preserve">WEEK </w:t>
-            </w:r>
-            <w:proofErr w:type="gramStart"/>
-            <w:r>
-              <w:rPr>
-                <w:b/>
-                <w:color w:val="FFFFFF"/>
-                <w:sz w:val="20"/>
-              </w:rPr>
-              <w:t>ONE  ·</w:t>
-            </w:r>
-            <w:proofErr w:type="gramEnd"/>
-            <w:r>
-              <w:rPr>
-                <w:b/>
-                <w:color w:val="FFFFFF"/>
-                <w:sz w:val="20"/>
-              </w:rPr>
-              <w:t xml:space="preserve">  DAYS ONE TO THREE</w:t>
+              <w:t>WEEK ONE  ·  DAYS ONE TO THREE</w:t>
             </w:r>
           </w:p>
         </w:tc>
@@ -530,6 +512,45 @@
               <w:t>Types Details or break down they do not know.</w:t>
             </w:r>
           </w:p>
+          <w:p>
+            <w:pPr>
+              <w:pStyle w:val="ListParagraph"/>
+              <w:numPr>
+                <w:ilvl w:val="0"/>
+                <w:numId w:val="11"/>
+              </w:numPr>
+              <w:spacing w:before="50" w:after="50"/>
+            </w:pPr>
+            <w:r>
+              <w:t xml:space="preserve"> Failure = a wrong answer sent, or more work for agents than it saves; "rather it said nothing than said something wrong". </w:t>
+            </w:r>
+          </w:p>
+          <w:p>
+            <w:pPr>
+              <w:pStyle w:val="ListParagraph"/>
+              <w:numPr>
+                <w:ilvl w:val="0"/>
+                <w:numId w:val="11"/>
+              </w:numPr>
+              <w:spacing w:before="50" w:after="50"/>
+            </w:pPr>
+            <w:r>
+              <w:t xml:space="preserve">500+ tickets a week, six agents; escalation costs about 4× a resolved ticket. </w:t>
+            </w:r>
+          </w:p>
+          <w:p>
+            <w:pPr>
+              <w:pStyle w:val="ListParagraph"/>
+              <w:numPr>
+                <w:ilvl w:val="0"/>
+                <w:numId w:val="11"/>
+              </w:numPr>
+              <w:spacing w:before="50" w:after="50"/>
+            </w:pPr>
+            <w:r>
+              <w:t>Compliance review in autumn; must say why it did what it did.</w:t>
+            </w:r>
+          </w:p>
         </w:tc>
         <w:tc>
           <w:tcPr>
@@ -730,7 +751,14 @@
               <w:rPr>
                 <w:lang w:val="en-IN"/>
               </w:rPr>
-              <w:t>7 out of 10 tickets she could answer without looking anything up.</w:t>
+              <w:t xml:space="preserve">7 out of 10 tickets she could </w:t>
+            </w:r>
+            <w:r>
+              <w:rPr>
+                <w:lang w:val="en-IN"/>
+              </w:rPr>
+              <w:lastRenderedPageBreak/>
+              <w:t>answer without looking anything up.</w:t>
             </w:r>
           </w:p>
           <w:p>
@@ -784,14 +812,7 @@
               <w:rPr>
                 <w:lang w:val="en-IN"/>
               </w:rPr>
-              <w:t xml:space="preserve">Escalates for 3 reasons: does </w:t>
-            </w:r>
-            <w:r>
-              <w:rPr>
-                <w:lang w:val="en-IN"/>
-              </w:rPr>
-              <w:lastRenderedPageBreak/>
-              <w:t>not know, not confident, or security.</w:t>
+              <w:t>Escalates for 3 reasons: does not know, not confident, or security.</w:t>
             </w:r>
           </w:p>
           <w:p>
@@ -899,7 +920,14 @@
               <w:rPr>
                 <w:lang w:val="en-IN"/>
               </w:rPr>
-              <w:t>Data does not show non-fluent tickets scoring worst.</w:t>
+              <w:t xml:space="preserve">Data does not show </w:t>
+            </w:r>
+            <w:r>
+              <w:rPr>
+                <w:lang w:val="en-IN"/>
+              </w:rPr>
+              <w:lastRenderedPageBreak/>
+              <w:t>non-fluent tickets scoring worst.</w:t>
             </w:r>
           </w:p>
           <w:p>
@@ -952,6 +980,7 @@
               <w:rPr>
                 <w:lang w:val="en-IN"/>
               </w:rPr>
+              <w:lastRenderedPageBreak/>
               <w:t>Share of tickets answerable from docs (her 7 in 10).</w:t>
             </w:r>
           </w:p>
@@ -970,7 +999,14 @@
               <w:rPr>
                 <w:lang w:val="en-IN"/>
               </w:rPr>
-              <w:t>Non-fluent CSAT and FCR vs fluent.</w:t>
+              <w:t xml:space="preserve">Non-fluent </w:t>
+            </w:r>
+            <w:r>
+              <w:rPr>
+                <w:lang w:val="en-IN"/>
+              </w:rPr>
+              <w:lastRenderedPageBreak/>
+              <w:t>CSAT and FCR vs fluent.</w:t>
             </w:r>
           </w:p>
           <w:p>
@@ -1020,6 +1056,7 @@
               <w:rPr>
                 <w:sz w:val="16"/>
               </w:rPr>
+              <w:lastRenderedPageBreak/>
               <w:t>Daniel Okonkwo, Tier Two Engineer</w:t>
             </w:r>
           </w:p>
@@ -1157,47 +1194,37 @@
               <w:rPr>
                 <w:lang w:val="en-IN"/>
               </w:rPr>
-              <w:t>Would not automate security, billing disputes, data location.</w:t>
-            </w:r>
-          </w:p>
-          <w:p>
-            <w:pPr>
-              <w:spacing w:before="50" w:after="50"/>
-            </w:pPr>
-          </w:p>
-        </w:tc>
-        <w:tc>
-          <w:tcPr>
-            <w:tcW w:w="2977" w:type="dxa"/>
-            <w:tcBorders>
-              <w:top w:val="single" w:sz="6" w:space="0" w:color="D9D9E0"/>
-              <w:left w:val="single" w:sz="6" w:space="0" w:color="D9D9E0"/>
-              <w:bottom w:val="single" w:sz="6" w:space="0" w:color="D9D9E0"/>
-              <w:right w:val="single" w:sz="6" w:space="0" w:color="D9D9E0"/>
-            </w:tcBorders>
-          </w:tcPr>
-          <w:p>
-            <w:pPr>
-              <w:pStyle w:val="ListParagraph"/>
-              <w:spacing w:before="50" w:after="50"/>
-            </w:pPr>
-          </w:p>
-          <w:p>
-            <w:pPr>
-              <w:numPr>
-                <w:ilvl w:val="0"/>
-                <w:numId w:val="19"/>
-              </w:numPr>
+              <w:t xml:space="preserve">Would not automate security, </w:t>
+            </w:r>
+            <w:r>
               <w:rPr>
                 <w:lang w:val="en-IN"/>
               </w:rPr>
-            </w:pPr>
-            <w:r>
-              <w:rPr>
-                <w:lang w:val="en-IN"/>
-              </w:rPr>
-              <w:t>Labels mark only 4 intents as never-auto; billing and data residency are mostly answerable.</w:t>
-            </w:r>
+              <w:lastRenderedPageBreak/>
+              <w:t>billing disputes, data location.</w:t>
+            </w:r>
+          </w:p>
+          <w:p>
+            <w:pPr>
+              <w:spacing w:before="50" w:after="50"/>
+            </w:pPr>
+          </w:p>
+        </w:tc>
+        <w:tc>
+          <w:tcPr>
+            <w:tcW w:w="2977" w:type="dxa"/>
+            <w:tcBorders>
+              <w:top w:val="single" w:sz="6" w:space="0" w:color="D9D9E0"/>
+              <w:left w:val="single" w:sz="6" w:space="0" w:color="D9D9E0"/>
+              <w:bottom w:val="single" w:sz="6" w:space="0" w:color="D9D9E0"/>
+              <w:right w:val="single" w:sz="6" w:space="0" w:color="D9D9E0"/>
+            </w:tcBorders>
+          </w:tcPr>
+          <w:p>
+            <w:pPr>
+              <w:pStyle w:val="ListParagraph"/>
+              <w:spacing w:before="50" w:after="50"/>
+            </w:pPr>
           </w:p>
           <w:p>
             <w:pPr>
@@ -1233,7 +1260,11 @@
               </w:numPr>
             </w:pPr>
             <w:r>
-              <w:t>That the ticket labels disagree with his never-automate list: only security, compliance, feature requests and unclear requests are marked never-auto; billing (87.5%) and data residency (72.4%) are mostly labelled answerable. Recorded as a disagreement to resolve, not as his error.</w:t>
+              <w:t xml:space="preserve">That the ticket labels disagree with his never-automate list: only security, compliance, feature requests and unclear requests are marked never-auto; billing (87.5%) and data residency (72.4%) are mostly labelled </w:t>
+            </w:r>
+            <w:r>
+              <w:lastRenderedPageBreak/>
+              <w:t>answerable. Recorded as a disagreement to resolve, not as his error.</w:t>
             </w:r>
           </w:p>
         </w:tc>
@@ -1257,6 +1288,7 @@
               <w:spacing w:before="50" w:after="50"/>
             </w:pPr>
             <w:r>
+              <w:lastRenderedPageBreak/>
               <w:t>Share of escalated tickets answerable from docs (his "half"): 49.1%.</w:t>
             </w:r>
           </w:p>
@@ -1283,7 +1315,11 @@
               <w:spacing w:before="50" w:after="50"/>
             </w:pPr>
             <w:r>
-              <w:t>Repeat contact rate on escalated vs resolved tickets: 38.4% vs 0%.</w:t>
+              <w:t xml:space="preserve">Repeat contact rate on escalated vs resolved tickets: </w:t>
+            </w:r>
+            <w:r>
+              <w:lastRenderedPageBreak/>
+              <w:t>38.4% vs 0%.</w:t>
             </w:r>
           </w:p>
           <w:p>
@@ -1662,6 +1698,7 @@
               <w:rPr>
                 <w:lang w:val="en-IN"/>
               </w:rPr>
+              <w:lastRenderedPageBreak/>
               <w:t>Wants to know when a reply is automated so he can calibrate trust.</w:t>
             </w:r>
           </w:p>
@@ -1709,6 +1746,7 @@
               <w:spacing w:before="50" w:after="50"/>
             </w:pPr>
             <w:r>
+              <w:lastRenderedPageBreak/>
               <w:t>Enterprise is the slowest tier in the data, not the fastest.</w:t>
             </w:r>
           </w:p>
@@ -1801,7 +1839,6 @@
           <w:color w:val="1A1A2E"/>
           <w:sz w:val="25"/>
         </w:rPr>
-        <w:lastRenderedPageBreak/>
         <w:t>Where the accounts disagree</w:t>
       </w:r>
     </w:p>
@@ -2252,7 +2289,11 @@
               <w:spacing w:before="50" w:after="50"/>
             </w:pPr>
             <w:r>
-              <w:t xml:space="preserve"> 2) Ines: articles accurate, search is keyword-on-title. </w:t>
+              <w:t xml:space="preserve"> 2) Ines: articles accurate, </w:t>
+            </w:r>
+            <w:r>
+              <w:lastRenderedPageBreak/>
+              <w:t xml:space="preserve">search is keyword-on-title. </w:t>
             </w:r>
           </w:p>
           <w:p>
@@ -2287,6 +2328,7 @@
               <w:spacing w:before="50" w:after="50"/>
             </w:pPr>
             <w:r>
+              <w:lastRenderedPageBreak/>
               <w:t xml:space="preserve">1) 357 tickets answerable (71.4%). </w:t>
             </w:r>
           </w:p>
@@ -2295,7 +2337,11 @@
               <w:spacing w:before="50" w:after="50"/>
             </w:pPr>
             <w:r>
-              <w:t xml:space="preserve">2) Only 61.3% of those resolved first time; 138 escalated anyway. </w:t>
+              <w:t xml:space="preserve">2) Only 61.3% of those </w:t>
+            </w:r>
+            <w:r>
+              <w:lastRenderedPageBreak/>
+              <w:t xml:space="preserve">resolved first time; 138 escalated anyway. </w:t>
             </w:r>
           </w:p>
           <w:p>
@@ -2319,11 +2365,7 @@
               <w:spacing w:before="50" w:after="50"/>
             </w:pPr>
             <w:r>
-              <w:t xml:space="preserve">5) All 29 articles show 0 </w:t>
-            </w:r>
-            <w:r>
-              <w:lastRenderedPageBreak/>
-              <w:t>days since review.</w:t>
+              <w:t>5) All 29 articles show 0 days since review.</w:t>
             </w:r>
           </w:p>
         </w:tc>
@@ -2351,7 +2393,11 @@
               <w:spacing w:before="50" w:after="50"/>
             </w:pPr>
             <w:r>
-              <w:t xml:space="preserve">2) Retrieval with citation is the fix, not writing new docs. </w:t>
+              <w:t xml:space="preserve">2) Retrieval with citation </w:t>
+            </w:r>
+            <w:r>
+              <w:lastRenderedPageBreak/>
+              <w:t xml:space="preserve">is the fix, not writing new docs. </w:t>
             </w:r>
           </w:p>
           <w:p>
@@ -2392,6 +2438,7 @@
               <w:spacing w:before="50" w:after="50"/>
             </w:pPr>
             <w:r>
+              <w:lastRenderedPageBreak/>
               <w:t>Do enterprise customers get faster service?</w:t>
             </w:r>
           </w:p>
@@ -2810,7 +2857,11 @@
               <w:spacing w:before="50" w:after="50"/>
             </w:pPr>
             <w:r>
-              <w:t>high urgency has the longest median (342 min) and lowest FCR (39.7%); low urgency 132 min, 48.4%.</w:t>
+              <w:t xml:space="preserve">high urgency has the longest median (342 min) and lowest FCR </w:t>
+            </w:r>
+            <w:r>
+              <w:lastRenderedPageBreak/>
+              <w:t>(39.7%); low urgency 132 min, 48.4%.</w:t>
             </w:r>
           </w:p>
         </w:tc>
@@ -2835,6 +2886,7 @@
               <w:spacing w:before="50" w:after="50"/>
             </w:pPr>
             <w:r>
+              <w:lastRenderedPageBreak/>
               <w:t>How first-reply time is measured</w:t>
             </w:r>
           </w:p>
@@ -2969,7 +3021,6 @@
     </w:p>
     <w:p>
       <w:r>
-        <w:lastRenderedPageBreak/>
         <w:br w:type="page"/>
       </w:r>
     </w:p>
@@ -3004,14 +3055,9 @@
       </w:r>
       <w:proofErr w:type="spellStart"/>
       <w:r>
-        <w:t>development_</w:t>
-      </w:r>
-      <w:proofErr w:type="gramStart"/>
-      <w:r>
-        <w:t>tickets.json</w:t>
+        <w:t>development_tickets.json</w:t>
       </w:r>
       <w:proofErr w:type="spellEnd"/>
-      <w:proofErr w:type="gramEnd"/>
       <w:r>
         <w:t xml:space="preserve"> and fill in the table below from the data itself rather than from impression. Where a figure surprises you, write the surprise down; those are usually the most productive threads to pull.</w:t>
       </w:r>
@@ -3202,14 +3248,9 @@
             </w:r>
             <w:proofErr w:type="spellStart"/>
             <w:r>
-              <w:t>development_</w:t>
-            </w:r>
-            <w:proofErr w:type="gramStart"/>
-            <w:r>
-              <w:t>tickets.json</w:t>
+              <w:t>development_tickets.json</w:t>
             </w:r>
             <w:proofErr w:type="spellEnd"/>
-            <w:proofErr w:type="gramEnd"/>
             <w:r>
               <w:t xml:space="preserve">; distinct </w:t>
             </w:r>
@@ -3547,12 +3588,10 @@
               <w:t xml:space="preserve">count of </w:t>
             </w:r>
             <w:proofErr w:type="spellStart"/>
-            <w:proofErr w:type="gramStart"/>
             <w:r>
               <w:t>labels.intent</w:t>
             </w:r>
             <w:proofErr w:type="spellEnd"/>
-            <w:proofErr w:type="gramEnd"/>
             <w:r>
               <w:t>.</w:t>
             </w:r>
@@ -3652,23 +3691,16 @@
               <w:t xml:space="preserve">count of </w:t>
             </w:r>
             <w:proofErr w:type="spellStart"/>
-            <w:proofErr w:type="gramStart"/>
             <w:r>
               <w:t>labels.urgency</w:t>
             </w:r>
             <w:proofErr w:type="spellEnd"/>
-            <w:proofErr w:type="gramEnd"/>
             <w:r>
               <w:t xml:space="preserve">; median of </w:t>
             </w:r>
             <w:proofErr w:type="spellStart"/>
-            <w:proofErr w:type="gramStart"/>
-            <w:r>
-              <w:t>history.resolution</w:t>
-            </w:r>
-            <w:proofErr w:type="gramEnd"/>
-            <w:r>
-              <w:t>_time_minutes</w:t>
+            <w:r>
+              <w:t>history.resolution_time_minutes</w:t>
             </w:r>
             <w:proofErr w:type="spellEnd"/>
             <w:r>
@@ -3773,25 +3805,18 @@
               <w:spacing w:before="50" w:after="50"/>
             </w:pPr>
             <w:proofErr w:type="spellStart"/>
-            <w:proofErr w:type="gramStart"/>
-            <w:r>
-              <w:t>history.first</w:t>
-            </w:r>
-            <w:proofErr w:type="gramEnd"/>
-            <w:r>
-              <w:t>_contact_resolution</w:t>
+            <w:r>
+              <w:t>history.first_contact_resolution</w:t>
             </w:r>
             <w:proofErr w:type="spellEnd"/>
             <w:r>
               <w:t xml:space="preserve"> and </w:t>
             </w:r>
             <w:proofErr w:type="spellStart"/>
-            <w:proofErr w:type="gramStart"/>
             <w:r>
               <w:t>history.escalated</w:t>
             </w:r>
             <w:proofErr w:type="spellEnd"/>
-            <w:proofErr w:type="gramEnd"/>
             <w:r>
               <w:t>.</w:t>
             </w:r>
@@ -3893,13 +3918,8 @@
               <w:t xml:space="preserve">mean of </w:t>
             </w:r>
             <w:proofErr w:type="spellStart"/>
-            <w:proofErr w:type="gramStart"/>
-            <w:r>
-              <w:t>history.csat</w:t>
-            </w:r>
-            <w:proofErr w:type="gramEnd"/>
-            <w:r>
-              <w:t>_rating</w:t>
+            <w:r>
+              <w:t>history.csat_rating</w:t>
             </w:r>
             <w:proofErr w:type="spellEnd"/>
             <w:r>
@@ -4029,12 +4049,10 @@
               <w:t xml:space="preserve">count of </w:t>
             </w:r>
             <w:proofErr w:type="spellStart"/>
-            <w:proofErr w:type="gramStart"/>
             <w:r>
               <w:t>labels.intent</w:t>
             </w:r>
             <w:proofErr w:type="spellEnd"/>
-            <w:proofErr w:type="gramEnd"/>
             <w:r>
               <w:t>; count of identical subject strings.</w:t>
             </w:r>
@@ -4150,38 +4168,26 @@
               <w:t> </w:t>
             </w:r>
             <w:proofErr w:type="spellStart"/>
-            <w:proofErr w:type="gramStart"/>
-            <w:r>
-              <w:t>labels.answerable</w:t>
-            </w:r>
-            <w:proofErr w:type="gramEnd"/>
-            <w:r>
-              <w:t>_from_docs</w:t>
+            <w:r>
+              <w:t>labels.answerable_from_docs</w:t>
             </w:r>
             <w:proofErr w:type="spellEnd"/>
             <w:r>
               <w:t xml:space="preserve"> crossed with </w:t>
             </w:r>
             <w:proofErr w:type="spellStart"/>
-            <w:proofErr w:type="gramStart"/>
-            <w:r>
-              <w:t>history.first</w:t>
-            </w:r>
-            <w:proofErr w:type="gramEnd"/>
-            <w:r>
-              <w:t>_contact_resolution</w:t>
+            <w:r>
+              <w:t>history.first_contact_resolution</w:t>
             </w:r>
             <w:proofErr w:type="spellEnd"/>
             <w:r>
               <w:t xml:space="preserve"> and </w:t>
             </w:r>
             <w:proofErr w:type="spellStart"/>
-            <w:proofErr w:type="gramStart"/>
             <w:r>
               <w:t>history.escalated</w:t>
             </w:r>
             <w:proofErr w:type="spellEnd"/>
-            <w:proofErr w:type="gramEnd"/>
             <w:r>
               <w:t>.</w:t>
             </w:r>
@@ -4608,13 +4614,8 @@
               <w:t> </w:t>
             </w:r>
             <w:proofErr w:type="spellStart"/>
-            <w:proofErr w:type="gramStart"/>
-            <w:r>
-              <w:t>history.repeat</w:t>
-            </w:r>
-            <w:proofErr w:type="gramEnd"/>
-            <w:r>
-              <w:t>_contact</w:t>
+            <w:r>
+              <w:t>history.repeat_contact</w:t>
             </w:r>
             <w:proofErr w:type="spellEnd"/>
             <w:r>
@@ -4685,6 +4686,9 @@
             <w:pPr>
               <w:spacing w:before="50" w:after="50"/>
             </w:pPr>
+            <w:r>
+              <w:t>Tickets that must never be auto-answered</w:t>
+            </w:r>
           </w:p>
         </w:tc>
         <w:tc>
@@ -4702,6 +4706,13 @@
             <w:pPr>
               <w:spacing w:before="50" w:after="50"/>
             </w:pPr>
+            <w:r>
+              <w:t xml:space="preserve"> 87 (17.4%); compliance 26, security 26, feature 20, unclear 15; expected </w:t>
+            </w:r>
+            <w:r>
+              <w:lastRenderedPageBreak/>
+              <w:t>route overall 62.2% auto, 37.8% escalate. </w:t>
+            </w:r>
           </w:p>
         </w:tc>
         <w:tc>
@@ -4719,6 +4730,23 @@
             <w:pPr>
               <w:spacing w:before="50" w:after="50"/>
             </w:pPr>
+            <w:proofErr w:type="spellStart"/>
+            <w:r>
+              <w:lastRenderedPageBreak/>
+              <w:t>labels.must_not_auto_respond</w:t>
+            </w:r>
+            <w:proofErr w:type="spellEnd"/>
+            <w:r>
+              <w:t xml:space="preserve">, </w:t>
+            </w:r>
+            <w:proofErr w:type="spellStart"/>
+            <w:r>
+              <w:t>labels.expected_route</w:t>
+            </w:r>
+            <w:proofErr w:type="spellEnd"/>
+            <w:r>
+              <w:t>.</w:t>
+            </w:r>
           </w:p>
         </w:tc>
         <w:tc>
@@ -4736,6 +4764,9 @@
             <w:pPr>
               <w:spacing w:before="50" w:after="50"/>
             </w:pPr>
+            <w:r>
+              <w:t>Daniel's list is wider than the labels; billing 87.5% and data residency 72.4% are labelled answerable.</w:t>
+            </w:r>
           </w:p>
         </w:tc>
       </w:tr>
@@ -4756,7 +4787,11 @@
           <w:p>
             <w:pPr>
               <w:spacing w:before="50" w:after="50"/>
-            </w:pPr>
+              <w:jc w:val="center"/>
+            </w:pPr>
+            <w:r>
+              <w:t>Resolution time</w:t>
+            </w:r>
           </w:p>
         </w:tc>
         <w:tc>
@@ -4773,6 +4808,9 @@
             <w:pPr>
               <w:spacing w:before="50" w:after="50"/>
             </w:pPr>
+            <w:r>
+              <w:t>mean 422 min, median 214, p95 1262; 45.0% within 2 h. </w:t>
+            </w:r>
           </w:p>
         </w:tc>
         <w:tc>
@@ -4789,6 +4827,14 @@
             <w:pPr>
               <w:spacing w:before="50" w:after="50"/>
             </w:pPr>
+            <w:proofErr w:type="spellStart"/>
+            <w:r>
+              <w:t>history.resolution_time_minutes</w:t>
+            </w:r>
+            <w:proofErr w:type="spellEnd"/>
+            <w:r>
+              <w:t>; no first-reply field exists.</w:t>
+            </w:r>
           </w:p>
         </w:tc>
         <w:tc>
@@ -4805,6 +4851,9 @@
             <w:pPr>
               <w:spacing w:before="50" w:after="50"/>
             </w:pPr>
+            <w:r>
+              <w:t>over half miss the 2 h SLA even on resolution; the 8 to 12 h claim cannot be checked.</w:t>
+            </w:r>
           </w:p>
         </w:tc>
       </w:tr>
@@ -4871,15 +4920,7 @@
                 <w:color w:val="333344"/>
                 <w:sz w:val="20"/>
               </w:rPr>
-              <w:t xml:space="preserve"> lack </w:t>
-            </w:r>
-            <w:r>
-              <w:rPr>
-                <w:color w:val="333344"/>
-                <w:sz w:val="20"/>
-              </w:rPr>
-              <w:lastRenderedPageBreak/>
-              <w:t>answers or merely lack a way of reaching them. Those are different problems with different solutions. The non-fluent segment matters for a different reason: something in the transcripts points at it, and the data will tell you whether that person was right.</w:t>
+              <w:t xml:space="preserve"> lack answers or merely lack a way of reaching them. Those are different problems with different solutions. The non-fluent segment matters for a different reason: something in the transcripts points at it, and the data will tell you whether that person was right.</w:t>
             </w:r>
           </w:p>
         </w:tc>
@@ -6831,15 +6872,7 @@
               <w:spacing w:before="50" w:after="50"/>
             </w:pPr>
             <w:r>
-              <w:t>"</w:t>
-            </w:r>
-            <w:proofErr w:type="gramStart"/>
-            <w:r>
-              <w:t>finding</w:t>
-            </w:r>
-            <w:proofErr w:type="gramEnd"/>
-            <w:r>
-              <w:t xml:space="preserve"> it and writing it out" is where the time goes; up to 40 min on unusual tickets.</w:t>
+              <w:t>"finding it and writing it out" is where the time goes; up to 40 min on unusual tickets.</w:t>
             </w:r>
           </w:p>
         </w:tc>
@@ -7175,13 +7208,8 @@
             <w:pPr>
               <w:spacing w:before="50" w:after="50"/>
             </w:pPr>
-            <w:proofErr w:type="gramStart"/>
-            <w:r>
-              <w:t>Yes</w:t>
-            </w:r>
-            <w:proofErr w:type="gramEnd"/>
-            <w:r>
-              <w:t xml:space="preserve"> for the decision.</w:t>
+            <w:r>
+              <w:t>Yes for the decision.</w:t>
             </w:r>
           </w:p>
           <w:p>
@@ -7233,6 +7261,7 @@
               <w:spacing w:before="50" w:after="50"/>
             </w:pPr>
             <w:r>
+              <w:lastRenderedPageBreak/>
               <w:t>7</w:t>
             </w:r>
           </w:p>
@@ -8612,6 +8641,114 @@
           </w:p>
         </w:tc>
       </w:tr>
+      <w:tr>
+        <w:trPr>
+          <w:jc w:val="center"/>
+        </w:trPr>
+        <w:tc>
+          <w:tcPr>
+            <w:tcW w:w="2016" w:type="dxa"/>
+            <w:tcBorders>
+              <w:top w:val="single" w:sz="6" w:space="0" w:color="D9D9E0"/>
+              <w:left w:val="single" w:sz="6" w:space="0" w:color="D9D9E0"/>
+              <w:bottom w:val="single" w:sz="6" w:space="0" w:color="D9D9E0"/>
+              <w:right w:val="single" w:sz="6" w:space="0" w:color="D9D9E0"/>
+            </w:tcBorders>
+          </w:tcPr>
+          <w:p>
+            <w:pPr>
+              <w:spacing w:before="50" w:after="50"/>
+              <w:rPr>
+                <w:b/>
+                <w:bCs/>
+              </w:rPr>
+            </w:pPr>
+            <w:r>
+              <w:rPr>
+                <w:b/>
+                <w:bCs/>
+              </w:rPr>
+              <w:t>agent workload and attrition</w:t>
+            </w:r>
+          </w:p>
+        </w:tc>
+        <w:tc>
+          <w:tcPr>
+            <w:tcW w:w="1728" w:type="dxa"/>
+            <w:tcBorders>
+              <w:top w:val="single" w:sz="6" w:space="0" w:color="D9D9E0"/>
+              <w:left w:val="single" w:sz="6" w:space="0" w:color="D9D9E0"/>
+              <w:bottom w:val="single" w:sz="6" w:space="0" w:color="D9D9E0"/>
+              <w:right w:val="single" w:sz="6" w:space="0" w:color="D9D9E0"/>
+            </w:tcBorders>
+          </w:tcPr>
+          <w:p>
+            <w:pPr>
+              <w:spacing w:before="50" w:after="50"/>
+            </w:pPr>
+            <w:r>
+              <w:t>Marcus</w:t>
+            </w:r>
+          </w:p>
+        </w:tc>
+        <w:tc>
+          <w:tcPr>
+            <w:tcW w:w="1440" w:type="dxa"/>
+            <w:tcBorders>
+              <w:top w:val="single" w:sz="6" w:space="0" w:color="D9D9E0"/>
+              <w:left w:val="single" w:sz="6" w:space="0" w:color="D9D9E0"/>
+              <w:bottom w:val="single" w:sz="6" w:space="0" w:color="D9D9E0"/>
+              <w:right w:val="single" w:sz="6" w:space="0" w:color="D9D9E0"/>
+            </w:tcBorders>
+          </w:tcPr>
+          <w:p>
+            <w:pPr>
+              <w:spacing w:before="50" w:after="50"/>
+            </w:pPr>
+            <w:r>
+              <w:t>rising, two agents left last quarter;</w:t>
+            </w:r>
+          </w:p>
+        </w:tc>
+        <w:tc>
+          <w:tcPr>
+            <w:tcW w:w="2448" w:type="dxa"/>
+            <w:tcBorders>
+              <w:top w:val="single" w:sz="6" w:space="0" w:color="D9D9E0"/>
+              <w:left w:val="single" w:sz="6" w:space="0" w:color="D9D9E0"/>
+              <w:bottom w:val="single" w:sz="6" w:space="0" w:color="D9D9E0"/>
+              <w:right w:val="single" w:sz="6" w:space="0" w:color="D9D9E0"/>
+            </w:tcBorders>
+          </w:tcPr>
+          <w:p>
+            <w:pPr>
+              <w:spacing w:before="50" w:after="50"/>
+            </w:pPr>
+            <w:r>
+              <w:t>stable, and the system must not add work</w:t>
+            </w:r>
+          </w:p>
+        </w:tc>
+        <w:tc>
+          <w:tcPr>
+            <w:tcW w:w="2016" w:type="dxa"/>
+            <w:tcBorders>
+              <w:top w:val="single" w:sz="6" w:space="0" w:color="D9D9E0"/>
+              <w:left w:val="single" w:sz="6" w:space="0" w:color="D9D9E0"/>
+              <w:bottom w:val="single" w:sz="6" w:space="0" w:color="D9D9E0"/>
+              <w:right w:val="single" w:sz="6" w:space="0" w:color="D9D9E0"/>
+            </w:tcBorders>
+          </w:tcPr>
+          <w:p>
+            <w:pPr>
+              <w:spacing w:before="50" w:after="50"/>
+            </w:pPr>
+            <w:r>
+              <w:t>low, not measurable in this project) or delete that clause from the citation.</w:t>
+            </w:r>
+          </w:p>
+        </w:tc>
+      </w:tr>
     </w:tbl>
     <w:p>
       <w:pPr>
@@ -8866,10 +9003,7 @@
               <w:spacing w:before="50" w:after="50"/>
             </w:pPr>
             <w:r>
-              <w:t xml:space="preserve">3) agent workload rising as it did with </w:t>
-            </w:r>
-            <w:r>
-              <w:t>canned.</w:t>
+              <w:t>3) agent workload rising as it did with canned.</w:t>
             </w:r>
           </w:p>
           <w:p>
@@ -8926,13 +9060,8 @@
               <w:spacing w:before="50" w:after="50"/>
             </w:pPr>
             <w:r>
-              <w:t xml:space="preserve">time to first reply against the 2-hour SLA, because it is the number the executive team sees every quarter, even though Marcus himself says first contact resolution matters </w:t>
-            </w:r>
-            <w:proofErr w:type="gramStart"/>
-            <w:r>
-              <w:t>more .</w:t>
-            </w:r>
-            <w:proofErr w:type="gramEnd"/>
+              <w:t>time to first reply against the 2-hour SLA, because it is the number the executive team sees every quarter, even though Marcus himself says first contact resolution matters more .</w:t>
+            </w:r>
           </w:p>
         </w:tc>
       </w:tr>
@@ -9563,14 +9692,9 @@
             </w:r>
             <w:proofErr w:type="spellStart"/>
             <w:r>
-              <w:t>ground_truth_</w:t>
-            </w:r>
-            <w:proofErr w:type="gramStart"/>
-            <w:r>
-              <w:t>responses.json</w:t>
+              <w:t>ground_truth_responses.json</w:t>
             </w:r>
             <w:proofErr w:type="spellEnd"/>
-            <w:proofErr w:type="gramEnd"/>
             <w:r>
               <w:t xml:space="preserve">: 200 answers by senior agents with </w:t>
             </w:r>
@@ -9588,15 +9712,7 @@
             </w:r>
             <w:proofErr w:type="spellEnd"/>
             <w:r>
-              <w:t xml:space="preserve"> lists. 3) Agents' private snippet files (Sofia, Daniel, </w:t>
-            </w:r>
-            <w:proofErr w:type="gramStart"/>
-            <w:r>
-              <w:t>Ines</w:t>
-            </w:r>
-            <w:proofErr w:type="gramEnd"/>
-            <w:r>
-              <w:t xml:space="preserve"> all mention them).</w:t>
+              <w:t xml:space="preserve"> lists. 3) Agents' private snippet files (Sofia, Daniel, Ines all mention them).</w:t>
             </w:r>
           </w:p>
         </w:tc>
@@ -10694,6 +10810,7 @@
               <w:rPr>
                 <w:sz w:val="16"/>
               </w:rPr>
+              <w:lastRenderedPageBreak/>
               <w:t>The documentation the system relies on goes out of date</w:t>
             </w:r>
           </w:p>
@@ -11075,6 +11192,7 @@
                 <w:b/>
                 <w:bCs/>
               </w:rPr>
+              <w:lastRenderedPageBreak/>
               <w:t>Escalations arrive without context</w:t>
             </w:r>
           </w:p>
@@ -11094,12 +11212,10 @@
               <w:spacing w:before="50" w:after="50"/>
             </w:pPr>
             <w:proofErr w:type="spellStart"/>
-            <w:proofErr w:type="gramStart"/>
             <w:r>
               <w:t>High;it</w:t>
             </w:r>
             <w:proofErr w:type="spellEnd"/>
-            <w:proofErr w:type="gramEnd"/>
             <w:r>
               <w:t xml:space="preserve"> is how it works today.</w:t>
             </w:r>
@@ -11299,7 +11415,6 @@
           <w:p>
             <w:pPr>
               <w:spacing w:before="50" w:after="50"/>
-              <w:jc w:val="center"/>
               <w:rPr>
                 <w:b/>
                 <w:bCs/>
@@ -11407,6 +11522,124 @@
             </w:r>
             <w:r>
               <w:t>separate ticket content from system instructions; detect and block, log the input for review.</w:t>
+            </w:r>
+          </w:p>
+        </w:tc>
+      </w:tr>
+      <w:tr>
+        <w:trPr>
+          <w:jc w:val="center"/>
+        </w:trPr>
+        <w:tc>
+          <w:tcPr>
+            <w:tcW w:w="2736" w:type="dxa"/>
+            <w:tcBorders>
+              <w:top w:val="single" w:sz="6" w:space="0" w:color="D9D9E0"/>
+              <w:left w:val="single" w:sz="6" w:space="0" w:color="D9D9E0"/>
+              <w:bottom w:val="single" w:sz="6" w:space="0" w:color="D9D9E0"/>
+              <w:right w:val="single" w:sz="6" w:space="0" w:color="D9D9E0"/>
+            </w:tcBorders>
+            <w:shd w:val="clear" w:color="auto" w:fill="F4F4F7"/>
+          </w:tcPr>
+          <w:p>
+            <w:pPr>
+              <w:spacing w:before="50" w:after="50"/>
+              <w:rPr>
+                <w:b/>
+                <w:bCs/>
+              </w:rPr>
+            </w:pPr>
+            <w:r>
+              <w:rPr>
+                <w:b/>
+                <w:bCs/>
+              </w:rPr>
+              <w:t>The model provider is unavailable or rate-limited</w:t>
+            </w:r>
+          </w:p>
+        </w:tc>
+        <w:tc>
+          <w:tcPr>
+            <w:tcW w:w="1375" w:type="dxa"/>
+            <w:tcBorders>
+              <w:top w:val="single" w:sz="6" w:space="0" w:color="D9D9E0"/>
+              <w:left w:val="single" w:sz="6" w:space="0" w:color="D9D9E0"/>
+              <w:bottom w:val="single" w:sz="6" w:space="0" w:color="D9D9E0"/>
+              <w:right w:val="single" w:sz="6" w:space="0" w:color="D9D9E0"/>
+            </w:tcBorders>
+            <w:shd w:val="clear" w:color="auto" w:fill="F4F4F7"/>
+          </w:tcPr>
+          <w:p>
+            <w:pPr>
+              <w:spacing w:before="50" w:after="50"/>
+            </w:pPr>
+            <w:r>
+              <w:t>high on a free tier;</w:t>
+            </w:r>
+          </w:p>
+        </w:tc>
+        <w:tc>
+          <w:tcPr>
+            <w:tcW w:w="1701" w:type="dxa"/>
+            <w:tcBorders>
+              <w:top w:val="single" w:sz="6" w:space="0" w:color="D9D9E0"/>
+              <w:left w:val="single" w:sz="6" w:space="0" w:color="D9D9E0"/>
+              <w:bottom w:val="single" w:sz="6" w:space="0" w:color="D9D9E0"/>
+              <w:right w:val="single" w:sz="6" w:space="0" w:color="D9D9E0"/>
+            </w:tcBorders>
+            <w:shd w:val="clear" w:color="auto" w:fill="F4F4F7"/>
+          </w:tcPr>
+          <w:p>
+            <w:pPr>
+              <w:spacing w:before="50" w:after="50"/>
+              <w:jc w:val="center"/>
+            </w:pPr>
+            <w:r>
+              <w:t>high, the run stops; </w:t>
+            </w:r>
+          </w:p>
+        </w:tc>
+        <w:tc>
+          <w:tcPr>
+            <w:tcW w:w="1701" w:type="dxa"/>
+            <w:tcBorders>
+              <w:top w:val="single" w:sz="6" w:space="0" w:color="D9D9E0"/>
+              <w:left w:val="single" w:sz="6" w:space="0" w:color="D9D9E0"/>
+              <w:bottom w:val="single" w:sz="6" w:space="0" w:color="D9D9E0"/>
+              <w:right w:val="single" w:sz="6" w:space="0" w:color="D9D9E0"/>
+            </w:tcBorders>
+            <w:shd w:val="clear" w:color="auto" w:fill="F4F4F7"/>
+          </w:tcPr>
+          <w:p>
+            <w:pPr>
+              <w:spacing w:before="50" w:after="50"/>
+              <w:jc w:val="center"/>
+            </w:pPr>
+            <w:r>
+              <w:t> every ticket in flight; </w:t>
+            </w:r>
+          </w:p>
+        </w:tc>
+        <w:tc>
+          <w:tcPr>
+            <w:tcW w:w="2135" w:type="dxa"/>
+            <w:tcBorders>
+              <w:top w:val="single" w:sz="6" w:space="0" w:color="D9D9E0"/>
+              <w:left w:val="single" w:sz="6" w:space="0" w:color="D9D9E0"/>
+              <w:bottom w:val="single" w:sz="6" w:space="0" w:color="D9D9E0"/>
+              <w:right w:val="single" w:sz="6" w:space="0" w:color="D9D9E0"/>
+            </w:tcBorders>
+            <w:shd w:val="clear" w:color="auto" w:fill="F4F4F7"/>
+          </w:tcPr>
+          <w:p>
+            <w:pPr>
+              <w:spacing w:before="50" w:after="50"/>
+            </w:pPr>
+            <w:r>
+              <w:t> </w:t>
+            </w:r>
+            <w:r>
+              <w:t>escalate with a logged reason, back off and retry, cache responses</w:t>
             </w:r>
           </w:p>
         </w:tc>
@@ -11620,18 +11853,10 @@
               <w:spacing w:before="50" w:after="50"/>
             </w:pPr>
             <w:r>
-              <w:t xml:space="preserve">Section 1, </w:t>
-            </w:r>
-            <w:proofErr w:type="gramStart"/>
-            <w:r>
-              <w:t xml:space="preserve">Marcus </w:t>
-            </w:r>
-            <w:r>
-              <w:t>,</w:t>
-            </w:r>
-            <w:proofErr w:type="gramEnd"/>
-            <w:r>
-              <w:t xml:space="preserve"> </w:t>
+              <w:t xml:space="preserve">Section 1, Marcus </w:t>
+            </w:r>
+            <w:r>
+              <w:t xml:space="preserve">, </w:t>
             </w:r>
             <w:r>
               <w:t>Section 4, row 1.</w:t>
@@ -11750,23 +11975,7 @@
               <w:spacing w:before="50" w:after="50"/>
             </w:pPr>
             <w:r>
-              <w:t xml:space="preserve">Section 1, Sofia row </w:t>
-            </w:r>
-            <w:proofErr w:type="gramStart"/>
-            <w:r>
-              <w:t>point</w:t>
-            </w:r>
-            <w:proofErr w:type="gramEnd"/>
-            <w:r>
-              <w:t xml:space="preserve"> 5, Ines row </w:t>
-            </w:r>
-            <w:proofErr w:type="gramStart"/>
-            <w:r>
-              <w:t>point</w:t>
-            </w:r>
-            <w:proofErr w:type="gramEnd"/>
-            <w:r>
-              <w:t xml:space="preserve"> 3, Daniel row points 3 to 5; </w:t>
+              <w:t xml:space="preserve">Section 1, Sofia row point 5, Ines row point 3, Daniel row points 3 to 5; </w:t>
             </w:r>
           </w:p>
           <w:p>
@@ -11865,15 +12074,7 @@
           </w:p>
           <w:p>
             <w:r>
-              <w:t xml:space="preserve">Section 1, </w:t>
-            </w:r>
-            <w:proofErr w:type="gramStart"/>
-            <w:r>
-              <w:t>Marcus</w:t>
-            </w:r>
-            <w:proofErr w:type="gramEnd"/>
-            <w:r>
-              <w:t xml:space="preserve"> row (failure conditions);</w:t>
+              <w:t>Section 1, Marcus row (failure conditions);</w:t>
             </w:r>
           </w:p>
           <w:p>
@@ -11883,15 +12084,7 @@
           </w:p>
           <w:p>
             <w:r>
-              <w:t xml:space="preserve">Section 2, row 12; Section 1, Daniel row </w:t>
-            </w:r>
-            <w:proofErr w:type="gramStart"/>
-            <w:r>
-              <w:t>point</w:t>
-            </w:r>
-            <w:proofErr w:type="gramEnd"/>
-            <w:r>
-              <w:t xml:space="preserve"> 5; Section 5, risks 1 and 5.</w:t>
+              <w:t>Section 2, row 12; Section 1, Daniel row point 5; Section 5, risks 1 and 5.</w:t>
             </w:r>
           </w:p>
         </w:tc>
@@ -12059,6 +12252,7 @@
               <w:rPr>
                 <w:sz w:val="17"/>
               </w:rPr>
+              <w:lastRenderedPageBreak/>
               <w:t>What will change if this is solved</w:t>
             </w:r>
           </w:p>
@@ -12145,31 +12339,15 @@
               <w:spacing w:before="50" w:after="50"/>
             </w:pPr>
             <w:r>
-              <w:t xml:space="preserve">Section 1, Daniel row </w:t>
-            </w:r>
-            <w:proofErr w:type="gramStart"/>
-            <w:r>
-              <w:t>point</w:t>
-            </w:r>
-            <w:proofErr w:type="gramEnd"/>
-            <w:r>
-              <w:t xml:space="preserve"> 5; </w:t>
-            </w:r>
-          </w:p>
-          <w:p>
-            <w:pPr>
-              <w:spacing w:before="50" w:after="50"/>
-            </w:pPr>
-            <w:r>
-              <w:t xml:space="preserve">Section 1, </w:t>
-            </w:r>
-            <w:proofErr w:type="gramStart"/>
-            <w:r>
-              <w:t>Marcus</w:t>
-            </w:r>
-            <w:proofErr w:type="gramEnd"/>
-            <w:r>
-              <w:t xml:space="preserve"> row (compliance).</w:t>
+              <w:t xml:space="preserve">Section 1, Daniel row point 5; </w:t>
+            </w:r>
+          </w:p>
+          <w:p>
+            <w:pPr>
+              <w:spacing w:before="50" w:after="50"/>
+            </w:pPr>
+            <w:r>
+              <w:t>Section 1, Marcus row (compliance).</w:t>
             </w:r>
           </w:p>
         </w:tc>
@@ -12576,39 +12754,7 @@
         <w:color w:val="4A4A63"/>
         <w:sz w:val="15"/>
       </w:rPr>
-      <w:t xml:space="preserve">Forward Deployed AI </w:t>
-    </w:r>
-    <w:proofErr w:type="gramStart"/>
-    <w:r>
-      <w:rPr>
-        <w:color w:val="4A4A63"/>
-        <w:sz w:val="15"/>
-      </w:rPr>
-      <w:t>Engineering  ·</w:t>
-    </w:r>
-    <w:proofErr w:type="gramEnd"/>
-    <w:r>
-      <w:rPr>
-        <w:color w:val="4A4A63"/>
-        <w:sz w:val="15"/>
-      </w:rPr>
-      <w:t xml:space="preserve">  Stage </w:t>
-    </w:r>
-    <w:proofErr w:type="gramStart"/>
-    <w:r>
-      <w:rPr>
-        <w:color w:val="4A4A63"/>
-        <w:sz w:val="15"/>
-      </w:rPr>
-      <w:t>One  ·</w:t>
-    </w:r>
-    <w:proofErr w:type="gramEnd"/>
-    <w:r>
-      <w:rPr>
-        <w:color w:val="4A4A63"/>
-        <w:sz w:val="15"/>
-      </w:rPr>
-      <w:t xml:space="preserve">  Discovery Workbook</w:t>
+      <w:t>Forward Deployed AI Engineering  ·  Stage One  ·  Discovery Workbook</w:t>
     </w:r>
   </w:p>
 </w:ftr>

</xml_diff>